<commit_message>
up: se actualizaron las etiquetas de la plantilla del aviso
</commit_message>
<xml_diff>
--- a/SGPla/Archivos/plantillas/aviso.docx
+++ b/SGPla/Archivos/plantillas/aviso.docx
@@ -1,6 +1,6 @@
 
 <file path=word/document.xml><?xml version="1.0" encoding="utf-8"?>
-<w:document xmlns:wpc="http://schemas.microsoft.com/office/word/2010/wordprocessingCanvas" xmlns:cx="http://schemas.microsoft.com/office/drawing/2014/chartex" xmlns:cx1="http://schemas.microsoft.com/office/drawing/2015/9/8/chartex" xmlns:cx2="http://schemas.microsoft.com/office/drawing/2015/10/21/chartex" xmlns:cx3="http://schemas.microsoft.com/office/drawing/2016/5/9/chartex" xmlns:cx4="http://schemas.microsoft.com/office/drawing/2016/5/10/chartex" xmlns:cx5="http://schemas.microsoft.com/office/drawing/2016/5/11/chartex" xmlns:cx6="http://schemas.microsoft.com/office/drawing/2016/5/12/chartex" xmlns:cx7="http://schemas.microsoft.com/office/drawing/2016/5/13/chartex" xmlns:cx8="http://schemas.microsoft.com/office/drawing/2016/5/14/chartex" xmlns:mc="http://schemas.openxmlformats.org/markup-compatibility/2006" xmlns:aink="http://schemas.microsoft.com/office/drawing/2016/ink" xmlns:am3d="http://schemas.microsoft.com/office/drawing/2017/model3d" xmlns:o="urn:schemas-microsoft-com:office:office" xmlns:oel="http://schemas.microsoft.com/office/2019/extlst" xmlns:r="http://schemas.openxmlformats.org/officeDocument/2006/relationships" xmlns:m="http://schemas.openxmlformats.org/officeDocument/2006/math" xmlns:v="urn:schemas-microsoft-com:vml" xmlns:wp14="http://schemas.microsoft.com/office/word/2010/wordprocessingDrawing" xmlns:wp="http://schemas.openxmlformats.org/drawingml/2006/wordprocessingDrawing" xmlns:w10="urn:schemas-microsoft-com:office:word" xmlns:w="http://schemas.openxmlformats.org/wordprocessingml/2006/main" xmlns:w14="http://schemas.microsoft.com/office/word/2010/wordml" xmlns:w15="http://schemas.microsoft.com/office/word/2012/wordml" xmlns:w16cei="http://schemas.microsoft.com/office/word/2026/wordml/cei" xmlns:w16cex="http://schemas.microsoft.com/office/word/2018/wordml/cex" xmlns:w16cid="http://schemas.microsoft.com/office/word/2016/wordml/cid" xmlns:w16="http://schemas.microsoft.com/office/word/2018/wordml" xmlns:w16du="http://schemas.microsoft.com/office/word/2023/wordml/word16du" xmlns:w16sdtdh="http://schemas.microsoft.com/office/word/2020/wordml/sdtdatahash" xmlns:w16sdtfl="http://schemas.microsoft.com/office/word/2024/wordml/sdtformatlock" xmlns:w16se="http://schemas.microsoft.com/office/word/2015/wordml/symex" xmlns:wpg="http://schemas.microsoft.com/office/word/2010/wordprocessingGroup" xmlns:wpi="http://schemas.microsoft.com/office/word/2010/wordprocessingInk" xmlns:wne="http://schemas.microsoft.com/office/word/2006/wordml" xmlns:wps="http://schemas.microsoft.com/office/word/2010/wordprocessingShape" mc:Ignorable="w14 w15 w16se w16cid w16 w16cex w16sdtdh w16sdtfl w16du wp14">
+<w:document xmlns:wpc="http://schemas.microsoft.com/office/word/2010/wordprocessingCanvas" xmlns:cx="http://schemas.microsoft.com/office/drawing/2014/chartex" xmlns:cx1="http://schemas.microsoft.com/office/drawing/2015/9/8/chartex" xmlns:cx2="http://schemas.microsoft.com/office/drawing/2015/10/21/chartex" xmlns:cx3="http://schemas.microsoft.com/office/drawing/2016/5/9/chartex" xmlns:cx4="http://schemas.microsoft.com/office/drawing/2016/5/10/chartex" xmlns:cx5="http://schemas.microsoft.com/office/drawing/2016/5/11/chartex" xmlns:cx6="http://schemas.microsoft.com/office/drawing/2016/5/12/chartex" xmlns:cx7="http://schemas.microsoft.com/office/drawing/2016/5/13/chartex" xmlns:cx8="http://schemas.microsoft.com/office/drawing/2016/5/14/chartex" xmlns:mc="http://schemas.openxmlformats.org/markup-compatibility/2006" xmlns:aink="http://schemas.microsoft.com/office/drawing/2016/ink" xmlns:am3d="http://schemas.microsoft.com/office/drawing/2017/model3d" xmlns:o="urn:schemas-microsoft-com:office:office" xmlns:oel="http://schemas.microsoft.com/office/2019/extlst" xmlns:r="http://schemas.openxmlformats.org/officeDocument/2006/relationships" xmlns:m="http://schemas.openxmlformats.org/officeDocument/2006/math" xmlns:v="urn:schemas-microsoft-com:vml" xmlns:wp14="http://schemas.microsoft.com/office/word/2010/wordprocessingDrawing" xmlns:wp="http://schemas.openxmlformats.org/drawingml/2006/wordprocessingDrawing" xmlns:w10="urn:schemas-microsoft-com:office:word" xmlns:w="http://schemas.openxmlformats.org/wordprocessingml/2006/main" xmlns:w14="http://schemas.microsoft.com/office/word/2010/wordml" xmlns:w15="http://schemas.microsoft.com/office/word/2012/wordml" xmlns:w16cex="http://schemas.microsoft.com/office/word/2018/wordml/cex" xmlns:w16cid="http://schemas.microsoft.com/office/word/2016/wordml/cid" xmlns:w16="http://schemas.microsoft.com/office/word/2018/wordml" xmlns:w16du="http://schemas.microsoft.com/office/word/2023/wordml/word16du" xmlns:w16sdtdh="http://schemas.microsoft.com/office/word/2020/wordml/sdtdatahash" xmlns:w16sdtfl="http://schemas.microsoft.com/office/word/2024/wordml/sdtformatlock" xmlns:w16se="http://schemas.microsoft.com/office/word/2015/wordml/symex" xmlns:wpg="http://schemas.microsoft.com/office/word/2010/wordprocessingGroup" xmlns:wpi="http://schemas.microsoft.com/office/word/2010/wordprocessingInk" xmlns:wne="http://schemas.microsoft.com/office/word/2006/wordml" xmlns:wps="http://schemas.microsoft.com/office/word/2010/wordprocessingShape" mc:Ignorable="w14 w15 w16se w16cid w16 w16cex w16sdtdh w16sdtfl w16du wp14">
   <w:body>
     <w:p>
       <w:pPr>
@@ -363,27 +363,7 @@
               <w:sz w:val="20"/>
               <w:szCs w:val="20"/>
             </w:rPr>
-            <w:t>[</w:t>
-          </w:r>
-          <w:proofErr w:type="spellStart"/>
-          <w:r>
-            <w:rPr>
-              <w:rFonts w:ascii="Arial" w:hAnsi="Arial" w:cs="Arial"/>
-              <w:bCs/>
-              <w:sz w:val="20"/>
-              <w:szCs w:val="20"/>
-            </w:rPr>
-            <w:t>Region</w:t>
-          </w:r>
-          <w:proofErr w:type="spellEnd"/>
-          <w:r>
-            <w:rPr>
-              <w:rFonts w:ascii="Arial" w:hAnsi="Arial" w:cs="Arial"/>
-              <w:bCs/>
-              <w:sz w:val="20"/>
-              <w:szCs w:val="20"/>
-            </w:rPr>
-            <w:t>]</w:t>
+            <w:t>[Region]</w:t>
           </w:r>
         </w:sdtContent>
       </w:sdt>
@@ -734,27 +714,7 @@
               <w:szCs w:val="20"/>
               <w:lang w:val="es-ES" w:bidi="es-ES"/>
             </w:rPr>
-            <w:t>[</w:t>
-          </w:r>
-          <w:proofErr w:type="spellStart"/>
-          <w:r>
-            <w:rPr>
-              <w:rFonts w:ascii="Arial" w:eastAsia="Courier New" w:hAnsi="Arial" w:cs="Arial"/>
-              <w:sz w:val="20"/>
-              <w:szCs w:val="20"/>
-              <w:lang w:val="es-ES" w:bidi="es-ES"/>
-            </w:rPr>
-            <w:t>Region</w:t>
-          </w:r>
-          <w:proofErr w:type="spellEnd"/>
-          <w:r>
-            <w:rPr>
-              <w:rFonts w:ascii="Arial" w:eastAsia="Courier New" w:hAnsi="Arial" w:cs="Arial"/>
-              <w:sz w:val="20"/>
-              <w:szCs w:val="20"/>
-              <w:lang w:val="es-ES" w:bidi="es-ES"/>
-            </w:rPr>
-            <w:t>]</w:t>
+            <w:t>[Region]</w:t>
           </w:r>
         </w:sdtContent>
       </w:sdt>
@@ -956,18 +916,8 @@
         </w:sdtContent>
       </w:sdt>
     </w:p>
-    <w:p>
-      <w:pPr>
-        <w:pStyle w:val="Sinespaciado"/>
-        <w:jc w:val="both"/>
-        <w:rPr>
-          <w:rFonts w:ascii="Arial" w:eastAsia="Courier New" w:hAnsi="Arial" w:cs="Arial"/>
-          <w:sz w:val="20"/>
-          <w:szCs w:val="20"/>
-          <w:lang w:val="es-ES" w:bidi="es-ES"/>
-        </w:rPr>
-      </w:pPr>
-      <w:r>
+    <w:sdt>
+      <w:sdtPr>
         <w:rPr>
           <w:rFonts w:ascii="Arial" w:eastAsia="Courier New" w:hAnsi="Arial" w:cs="Arial"/>
           <w:b/>
@@ -976,33 +926,43 @@
           <w:szCs w:val="20"/>
           <w:lang w:val="es-ES" w:bidi="es-ES"/>
         </w:rPr>
-        <w:t>PROGRAMA EDUCATIVO:</w:t>
-      </w:r>
-      <w:r>
-        <w:rPr>
-          <w:rFonts w:ascii="Arial" w:eastAsia="Courier New" w:hAnsi="Arial" w:cs="Arial"/>
-          <w:sz w:val="20"/>
-          <w:szCs w:val="20"/>
-          <w:lang w:val="es-ES" w:bidi="es-ES"/>
-        </w:rPr>
-        <w:t xml:space="preserve"> </w:t>
-      </w:r>
-      <w:sdt>
-        <w:sdtPr>
-          <w:rPr>
-            <w:rFonts w:ascii="Arial" w:eastAsia="Courier New" w:hAnsi="Arial" w:cs="Arial"/>
-            <w:sz w:val="20"/>
-            <w:szCs w:val="20"/>
-            <w:lang w:val="es-ES" w:bidi="es-ES"/>
-          </w:rPr>
-          <w:tag w:val="ProgramaEducativo"/>
-          <w:id w:val="171611001"/>
-          <w:placeholder>
-            <w:docPart w:val="DefaultPlaceholder_-1854013440"/>
-          </w:placeholder>
-          <w:text/>
-        </w:sdtPr>
-        <w:sdtContent>
+        <w:tag w:val="BloquePrograma"/>
+        <w:id w:val="761498617"/>
+        <w:placeholder>
+          <w:docPart w:val="DefaultPlaceholder_-1854013440"/>
+        </w:placeholder>
+      </w:sdtPr>
+      <w:sdtEndPr>
+        <w:rPr>
+          <w:rFonts w:eastAsiaTheme="minorEastAsia"/>
+          <w:b w:val="0"/>
+          <w:bCs w:val="0"/>
+          <w:lang w:val="es-ES_tradnl" w:bidi="ar-SA"/>
+        </w:rPr>
+      </w:sdtEndPr>
+      <w:sdtContent>
+        <w:p>
+          <w:pPr>
+            <w:pStyle w:val="Sinespaciado"/>
+            <w:jc w:val="both"/>
+            <w:rPr>
+              <w:rFonts w:ascii="Arial" w:eastAsia="Courier New" w:hAnsi="Arial" w:cs="Arial"/>
+              <w:sz w:val="20"/>
+              <w:szCs w:val="20"/>
+              <w:lang w:val="es-ES" w:bidi="es-ES"/>
+            </w:rPr>
+          </w:pPr>
+          <w:r>
+            <w:rPr>
+              <w:rFonts w:ascii="Arial" w:eastAsia="Courier New" w:hAnsi="Arial" w:cs="Arial"/>
+              <w:b/>
+              <w:bCs/>
+              <w:sz w:val="20"/>
+              <w:szCs w:val="20"/>
+              <w:lang w:val="es-ES" w:bidi="es-ES"/>
+            </w:rPr>
+            <w:t>PROGRAMA EDUCATIVO:</w:t>
+          </w:r>
           <w:r>
             <w:rPr>
               <w:rFonts w:ascii="Arial" w:eastAsia="Courier New" w:hAnsi="Arial" w:cs="Arial"/>
@@ -1010,1060 +970,1061 @@
               <w:szCs w:val="20"/>
               <w:lang w:val="es-ES" w:bidi="es-ES"/>
             </w:rPr>
-            <w:t>[</w:t>
+            <w:t xml:space="preserve"> </w:t>
           </w:r>
-          <w:proofErr w:type="spellStart"/>
+          <w:sdt>
+            <w:sdtPr>
+              <w:rPr>
+                <w:rFonts w:ascii="Arial" w:eastAsia="Courier New" w:hAnsi="Arial" w:cs="Arial"/>
+                <w:sz w:val="20"/>
+                <w:szCs w:val="20"/>
+                <w:lang w:val="es-ES" w:bidi="es-ES"/>
+              </w:rPr>
+              <w:tag w:val="ProgramaEducativo"/>
+              <w:id w:val="171611001"/>
+              <w:placeholder>
+                <w:docPart w:val="DefaultPlaceholder_-1854013440"/>
+              </w:placeholder>
+              <w:text/>
+            </w:sdtPr>
+            <w:sdtContent>
+              <w:r>
+                <w:rPr>
+                  <w:rFonts w:ascii="Arial" w:eastAsia="Courier New" w:hAnsi="Arial" w:cs="Arial"/>
+                  <w:sz w:val="20"/>
+                  <w:szCs w:val="20"/>
+                  <w:lang w:val="es-ES" w:bidi="es-ES"/>
+                </w:rPr>
+                <w:t>[</w:t>
+              </w:r>
+              <w:proofErr w:type="spellStart"/>
+              <w:r>
+                <w:rPr>
+                  <w:rFonts w:ascii="Arial" w:eastAsia="Courier New" w:hAnsi="Arial" w:cs="Arial"/>
+                  <w:sz w:val="20"/>
+                  <w:szCs w:val="20"/>
+                  <w:lang w:val="es-ES" w:bidi="es-ES"/>
+                </w:rPr>
+                <w:t>ProgramaEducativo</w:t>
+              </w:r>
+              <w:proofErr w:type="spellEnd"/>
+              <w:r>
+                <w:rPr>
+                  <w:rFonts w:ascii="Arial" w:eastAsia="Courier New" w:hAnsi="Arial" w:cs="Arial"/>
+                  <w:sz w:val="20"/>
+                  <w:szCs w:val="20"/>
+                  <w:lang w:val="es-ES" w:bidi="es-ES"/>
+                </w:rPr>
+                <w:t>]</w:t>
+              </w:r>
+            </w:sdtContent>
+          </w:sdt>
+        </w:p>
+        <w:p>
+          <w:pPr>
+            <w:pStyle w:val="Sinespaciado"/>
+            <w:jc w:val="both"/>
+            <w:rPr>
+              <w:rFonts w:ascii="Gill Sans MT" w:eastAsia="Courier New" w:hAnsi="Gill Sans MT" w:cs="Courier New"/>
+              <w:sz w:val="22"/>
+              <w:szCs w:val="22"/>
+              <w:lang w:val="es-ES" w:bidi="es-ES"/>
+            </w:rPr>
+          </w:pPr>
+        </w:p>
+        <w:p>
+          <w:pPr>
+            <w:pStyle w:val="Sinespaciado"/>
+            <w:jc w:val="both"/>
+            <w:rPr>
+              <w:rFonts w:ascii="Gill Sans MT" w:eastAsia="Courier New" w:hAnsi="Gill Sans MT" w:cs="Courier New"/>
+              <w:sz w:val="22"/>
+              <w:szCs w:val="22"/>
+              <w:lang w:val="es-ES" w:bidi="es-ES"/>
+            </w:rPr>
+          </w:pPr>
+        </w:p>
+        <w:tbl>
+          <w:tblPr>
+            <w:tblW w:w="11000" w:type="dxa"/>
+            <w:tblBorders>
+              <w:top w:val="single" w:sz="4" w:space="0" w:color="auto"/>
+              <w:left w:val="single" w:sz="4" w:space="0" w:color="auto"/>
+              <w:bottom w:val="single" w:sz="4" w:space="0" w:color="auto"/>
+              <w:right w:val="single" w:sz="4" w:space="0" w:color="auto"/>
+              <w:insideH w:val="single" w:sz="4" w:space="0" w:color="auto"/>
+              <w:insideV w:val="single" w:sz="4" w:space="0" w:color="auto"/>
+            </w:tblBorders>
+            <w:tblLayout w:type="fixed"/>
+            <w:tblLook w:val="0000" w:firstRow="0" w:lastRow="0" w:firstColumn="0" w:lastColumn="0" w:noHBand="0" w:noVBand="0"/>
+          </w:tblPr>
+          <w:tblGrid>
+            <w:gridCol w:w="717"/>
+            <w:gridCol w:w="2167"/>
+            <w:gridCol w:w="884"/>
+            <w:gridCol w:w="647"/>
+            <w:gridCol w:w="722"/>
+            <w:gridCol w:w="721"/>
+            <w:gridCol w:w="722"/>
+            <w:gridCol w:w="722"/>
+            <w:gridCol w:w="752"/>
+            <w:gridCol w:w="528"/>
+            <w:gridCol w:w="1841"/>
+            <w:gridCol w:w="577"/>
+          </w:tblGrid>
+          <w:tr>
+            <w:trPr>
+              <w:trHeight w:val="108"/>
+            </w:trPr>
+            <w:tc>
+              <w:tcPr>
+                <w:tcW w:w="717" w:type="dxa"/>
+                <w:vMerge w:val="restart"/>
+                <w:tcMar>
+                  <w:top w:w="20" w:type="nil"/>
+                  <w:left w:w="20" w:type="nil"/>
+                  <w:bottom w:w="20" w:type="nil"/>
+                  <w:right w:w="20" w:type="nil"/>
+                </w:tcMar>
+                <w:vAlign w:val="center"/>
+              </w:tcPr>
+              <w:p>
+                <w:pPr>
+                  <w:adjustRightInd w:val="0"/>
+                  <w:ind w:right="-459"/>
+                  <w:rPr>
+                    <w:rFonts w:ascii="Gill Sans MT" w:hAnsi="Gill Sans MT"/>
+                    <w:sz w:val="16"/>
+                  </w:rPr>
+                </w:pPr>
+                <w:r>
+                  <w:rPr>
+                    <w:rFonts w:ascii="Gill Sans MT" w:hAnsi="Gill Sans MT"/>
+                    <w:b/>
+                    <w:bCs/>
+                    <w:sz w:val="16"/>
+                  </w:rPr>
+                  <w:t>Horas</w:t>
+                </w:r>
+              </w:p>
+            </w:tc>
+            <w:tc>
+              <w:tcPr>
+                <w:tcW w:w="2167" w:type="dxa"/>
+                <w:vMerge w:val="restart"/>
+                <w:tcMar>
+                  <w:top w:w="20" w:type="nil"/>
+                  <w:left w:w="20" w:type="nil"/>
+                  <w:bottom w:w="20" w:type="nil"/>
+                  <w:right w:w="20" w:type="nil"/>
+                </w:tcMar>
+                <w:vAlign w:val="center"/>
+              </w:tcPr>
+              <w:p>
+                <w:pPr>
+                  <w:adjustRightInd w:val="0"/>
+                  <w:ind w:right="40"/>
+                  <w:jc w:val="center"/>
+                  <w:rPr>
+                    <w:rFonts w:ascii="Gill Sans MT" w:hAnsi="Gill Sans MT"/>
+                    <w:sz w:val="16"/>
+                  </w:rPr>
+                </w:pPr>
+                <w:r>
+                  <w:rPr>
+                    <w:rFonts w:ascii="Gill Sans MT" w:hAnsi="Gill Sans MT"/>
+                    <w:b/>
+                    <w:bCs/>
+                    <w:sz w:val="16"/>
+                  </w:rPr>
+                  <w:t>Experiencia Educativa (EE)</w:t>
+                </w:r>
+              </w:p>
+            </w:tc>
+            <w:tc>
+              <w:tcPr>
+                <w:tcW w:w="884" w:type="dxa"/>
+                <w:vMerge w:val="restart"/>
+                <w:tcMar>
+                  <w:top w:w="20" w:type="nil"/>
+                  <w:left w:w="20" w:type="nil"/>
+                  <w:bottom w:w="20" w:type="nil"/>
+                  <w:right w:w="20" w:type="nil"/>
+                </w:tcMar>
+                <w:vAlign w:val="center"/>
+              </w:tcPr>
+              <w:p>
+                <w:pPr>
+                  <w:adjustRightInd w:val="0"/>
+                  <w:ind w:right="-461"/>
+                  <w:rPr>
+                    <w:rFonts w:ascii="Gill Sans MT" w:hAnsi="Gill Sans MT"/>
+                    <w:sz w:val="16"/>
+                  </w:rPr>
+                </w:pPr>
+                <w:r>
+                  <w:rPr>
+                    <w:rFonts w:ascii="Gill Sans MT" w:hAnsi="Gill Sans MT"/>
+                    <w:b/>
+                    <w:bCs/>
+                    <w:sz w:val="16"/>
+                  </w:rPr>
+                  <w:t>NRC</w:t>
+                </w:r>
+              </w:p>
+            </w:tc>
+            <w:tc>
+              <w:tcPr>
+                <w:tcW w:w="647" w:type="dxa"/>
+                <w:vMerge w:val="restart"/>
+                <w:tcMar>
+                  <w:top w:w="20" w:type="nil"/>
+                  <w:left w:w="20" w:type="nil"/>
+                  <w:bottom w:w="20" w:type="nil"/>
+                  <w:right w:w="20" w:type="nil"/>
+                </w:tcMar>
+                <w:vAlign w:val="center"/>
+              </w:tcPr>
+              <w:p>
+                <w:pPr>
+                  <w:adjustRightInd w:val="0"/>
+                  <w:ind w:right="-461"/>
+                  <w:jc w:val="both"/>
+                  <w:rPr>
+                    <w:rFonts w:ascii="Gill Sans MT" w:hAnsi="Gill Sans MT"/>
+                    <w:sz w:val="16"/>
+                  </w:rPr>
+                </w:pPr>
+                <w:r>
+                  <w:rPr>
+                    <w:rFonts w:ascii="Gill Sans MT" w:hAnsi="Gill Sans MT"/>
+                    <w:b/>
+                    <w:bCs/>
+                    <w:sz w:val="16"/>
+                  </w:rPr>
+                  <w:t>Plaza</w:t>
+                </w:r>
+              </w:p>
+            </w:tc>
+            <w:tc>
+              <w:tcPr>
+                <w:tcW w:w="3639" w:type="dxa"/>
+                <w:gridSpan w:val="5"/>
+                <w:tcMar>
+                  <w:top w:w="20" w:type="nil"/>
+                  <w:left w:w="20" w:type="nil"/>
+                  <w:bottom w:w="20" w:type="nil"/>
+                  <w:right w:w="20" w:type="nil"/>
+                </w:tcMar>
+                <w:vAlign w:val="center"/>
+              </w:tcPr>
+              <w:p>
+                <w:pPr>
+                  <w:adjustRightInd w:val="0"/>
+                  <w:ind w:right="-461"/>
+                  <w:jc w:val="center"/>
+                  <w:rPr>
+                    <w:rFonts w:ascii="Gill Sans MT" w:hAnsi="Gill Sans MT"/>
+                    <w:sz w:val="18"/>
+                  </w:rPr>
+                </w:pPr>
+                <w:r>
+                  <w:rPr>
+                    <w:rFonts w:ascii="Gill Sans MT" w:hAnsi="Gill Sans MT"/>
+                    <w:b/>
+                    <w:bCs/>
+                    <w:sz w:val="18"/>
+                  </w:rPr>
+                  <w:t>Horario</w:t>
+                </w:r>
+              </w:p>
+            </w:tc>
+            <w:tc>
+              <w:tcPr>
+                <w:tcW w:w="528" w:type="dxa"/>
+              </w:tcPr>
+              <w:p>
+                <w:pPr>
+                  <w:adjustRightInd w:val="0"/>
+                  <w:ind w:right="-461"/>
+                  <w:rPr>
+                    <w:rFonts w:ascii="Gill Sans MT" w:hAnsi="Gill Sans MT"/>
+                    <w:b/>
+                    <w:bCs/>
+                    <w:sz w:val="16"/>
+                  </w:rPr>
+                </w:pPr>
+              </w:p>
+            </w:tc>
+            <w:tc>
+              <w:tcPr>
+                <w:tcW w:w="1841" w:type="dxa"/>
+                <w:vMerge w:val="restart"/>
+                <w:tcMar>
+                  <w:top w:w="20" w:type="nil"/>
+                  <w:left w:w="20" w:type="nil"/>
+                  <w:bottom w:w="20" w:type="nil"/>
+                  <w:right w:w="20" w:type="nil"/>
+                </w:tcMar>
+                <w:vAlign w:val="center"/>
+              </w:tcPr>
+              <w:p>
+                <w:pPr>
+                  <w:adjustRightInd w:val="0"/>
+                  <w:ind w:right="-461"/>
+                  <w:rPr>
+                    <w:rFonts w:ascii="Gill Sans MT" w:hAnsi="Gill Sans MT"/>
+                    <w:sz w:val="16"/>
+                  </w:rPr>
+                </w:pPr>
+                <w:r>
+                  <w:rPr>
+                    <w:rFonts w:ascii="Gill Sans MT" w:hAnsi="Gill Sans MT"/>
+                    <w:b/>
+                    <w:bCs/>
+                    <w:sz w:val="16"/>
+                  </w:rPr>
+                  <w:t xml:space="preserve">   Tipo de Contratación</w:t>
+                </w:r>
+              </w:p>
+            </w:tc>
+            <w:tc>
+              <w:tcPr>
+                <w:tcW w:w="577" w:type="dxa"/>
+                <w:vMerge w:val="restart"/>
+                <w:tcMar>
+                  <w:top w:w="20" w:type="nil"/>
+                  <w:left w:w="20" w:type="nil"/>
+                  <w:bottom w:w="20" w:type="nil"/>
+                  <w:right w:w="20" w:type="nil"/>
+                </w:tcMar>
+                <w:vAlign w:val="center"/>
+              </w:tcPr>
+              <w:p>
+                <w:pPr>
+                  <w:adjustRightInd w:val="0"/>
+                  <w:ind w:right="-461"/>
+                  <w:rPr>
+                    <w:rFonts w:ascii="Gill Sans MT" w:hAnsi="Gill Sans MT"/>
+                    <w:sz w:val="16"/>
+                    <w:szCs w:val="16"/>
+                  </w:rPr>
+                </w:pPr>
+                <w:r>
+                  <w:rPr>
+                    <w:rFonts w:ascii="Gill Sans MT" w:hAnsi="Gill Sans MT"/>
+                    <w:b/>
+                    <w:bCs/>
+                    <w:sz w:val="16"/>
+                    <w:szCs w:val="16"/>
+                  </w:rPr>
+                  <w:t>PA</w:t>
+                </w:r>
+              </w:p>
+            </w:tc>
+          </w:tr>
+          <w:tr>
+            <w:trPr>
+              <w:trHeight w:val="135"/>
+            </w:trPr>
+            <w:tc>
+              <w:tcPr>
+                <w:tcW w:w="717" w:type="dxa"/>
+                <w:vMerge/>
+                <w:tcMar>
+                  <w:top w:w="20" w:type="nil"/>
+                  <w:left w:w="20" w:type="nil"/>
+                  <w:bottom w:w="20" w:type="nil"/>
+                  <w:right w:w="20" w:type="nil"/>
+                </w:tcMar>
+                <w:vAlign w:val="center"/>
+              </w:tcPr>
+              <w:p>
+                <w:pPr>
+                  <w:adjustRightInd w:val="0"/>
+                  <w:ind w:right="-461"/>
+                  <w:jc w:val="center"/>
+                  <w:rPr>
+                    <w:rFonts w:ascii="Gill Sans MT" w:hAnsi="Gill Sans MT"/>
+                    <w:sz w:val="18"/>
+                  </w:rPr>
+                </w:pPr>
+              </w:p>
+            </w:tc>
+            <w:tc>
+              <w:tcPr>
+                <w:tcW w:w="2167" w:type="dxa"/>
+                <w:vMerge/>
+                <w:tcMar>
+                  <w:top w:w="20" w:type="nil"/>
+                  <w:left w:w="20" w:type="nil"/>
+                  <w:bottom w:w="20" w:type="nil"/>
+                  <w:right w:w="20" w:type="nil"/>
+                </w:tcMar>
+                <w:vAlign w:val="center"/>
+              </w:tcPr>
+              <w:p>
+                <w:pPr>
+                  <w:adjustRightInd w:val="0"/>
+                  <w:ind w:right="40"/>
+                  <w:rPr>
+                    <w:rFonts w:ascii="Gill Sans MT" w:hAnsi="Gill Sans MT"/>
+                    <w:sz w:val="18"/>
+                  </w:rPr>
+                </w:pPr>
+              </w:p>
+            </w:tc>
+            <w:tc>
+              <w:tcPr>
+                <w:tcW w:w="884" w:type="dxa"/>
+                <w:vMerge/>
+                <w:tcMar>
+                  <w:top w:w="20" w:type="nil"/>
+                  <w:left w:w="20" w:type="nil"/>
+                  <w:bottom w:w="20" w:type="nil"/>
+                  <w:right w:w="20" w:type="nil"/>
+                </w:tcMar>
+                <w:vAlign w:val="center"/>
+              </w:tcPr>
+              <w:p>
+                <w:pPr>
+                  <w:adjustRightInd w:val="0"/>
+                  <w:ind w:right="-461"/>
+                  <w:rPr>
+                    <w:rFonts w:ascii="Gill Sans MT" w:hAnsi="Gill Sans MT"/>
+                    <w:sz w:val="18"/>
+                  </w:rPr>
+                </w:pPr>
+              </w:p>
+            </w:tc>
+            <w:tc>
+              <w:tcPr>
+                <w:tcW w:w="647" w:type="dxa"/>
+                <w:vMerge/>
+                <w:tcMar>
+                  <w:top w:w="20" w:type="nil"/>
+                  <w:left w:w="20" w:type="nil"/>
+                  <w:bottom w:w="20" w:type="nil"/>
+                  <w:right w:w="20" w:type="nil"/>
+                </w:tcMar>
+                <w:vAlign w:val="center"/>
+              </w:tcPr>
+              <w:p>
+                <w:pPr>
+                  <w:adjustRightInd w:val="0"/>
+                  <w:ind w:right="-461"/>
+                  <w:rPr>
+                    <w:rFonts w:ascii="Gill Sans MT" w:hAnsi="Gill Sans MT"/>
+                    <w:sz w:val="18"/>
+                  </w:rPr>
+                </w:pPr>
+              </w:p>
+            </w:tc>
+            <w:tc>
+              <w:tcPr>
+                <w:tcW w:w="722" w:type="dxa"/>
+                <w:tcMar>
+                  <w:top w:w="20" w:type="nil"/>
+                  <w:left w:w="20" w:type="nil"/>
+                  <w:bottom w:w="20" w:type="nil"/>
+                  <w:right w:w="20" w:type="nil"/>
+                </w:tcMar>
+              </w:tcPr>
+              <w:p>
+                <w:pPr>
+                  <w:adjustRightInd w:val="0"/>
+                  <w:ind w:right="-461"/>
+                  <w:rPr>
+                    <w:rFonts w:ascii="Gill Sans MT" w:hAnsi="Gill Sans MT"/>
+                    <w:sz w:val="18"/>
+                  </w:rPr>
+                </w:pPr>
+                <w:r>
+                  <w:rPr>
+                    <w:rFonts w:ascii="Gill Sans MT" w:hAnsi="Gill Sans MT"/>
+                    <w:b/>
+                    <w:bCs/>
+                    <w:sz w:val="18"/>
+                  </w:rPr>
+                  <w:t>L</w:t>
+                </w:r>
+              </w:p>
+            </w:tc>
+            <w:tc>
+              <w:tcPr>
+                <w:tcW w:w="721" w:type="dxa"/>
+                <w:tcMar>
+                  <w:top w:w="20" w:type="nil"/>
+                  <w:left w:w="20" w:type="nil"/>
+                  <w:bottom w:w="20" w:type="nil"/>
+                  <w:right w:w="20" w:type="nil"/>
+                </w:tcMar>
+              </w:tcPr>
+              <w:p>
+                <w:pPr>
+                  <w:adjustRightInd w:val="0"/>
+                  <w:ind w:right="-461"/>
+                  <w:rPr>
+                    <w:rFonts w:ascii="Gill Sans MT" w:hAnsi="Gill Sans MT"/>
+                    <w:sz w:val="18"/>
+                  </w:rPr>
+                </w:pPr>
+                <w:r>
+                  <w:rPr>
+                    <w:rFonts w:ascii="Gill Sans MT" w:hAnsi="Gill Sans MT"/>
+                    <w:b/>
+                    <w:bCs/>
+                    <w:sz w:val="18"/>
+                  </w:rPr>
+                  <w:t>M</w:t>
+                </w:r>
+              </w:p>
+            </w:tc>
+            <w:tc>
+              <w:tcPr>
+                <w:tcW w:w="722" w:type="dxa"/>
+                <w:tcMar>
+                  <w:top w:w="20" w:type="nil"/>
+                  <w:left w:w="20" w:type="nil"/>
+                  <w:bottom w:w="20" w:type="nil"/>
+                  <w:right w:w="20" w:type="nil"/>
+                </w:tcMar>
+              </w:tcPr>
+              <w:p>
+                <w:pPr>
+                  <w:adjustRightInd w:val="0"/>
+                  <w:ind w:right="-461"/>
+                  <w:rPr>
+                    <w:rFonts w:ascii="Gill Sans MT" w:hAnsi="Gill Sans MT"/>
+                    <w:sz w:val="18"/>
+                  </w:rPr>
+                </w:pPr>
+                <w:r>
+                  <w:rPr>
+                    <w:rFonts w:ascii="Gill Sans MT" w:hAnsi="Gill Sans MT"/>
+                    <w:b/>
+                    <w:bCs/>
+                    <w:sz w:val="18"/>
+                  </w:rPr>
+                  <w:t>M</w:t>
+                </w:r>
+              </w:p>
+            </w:tc>
+            <w:tc>
+              <w:tcPr>
+                <w:tcW w:w="722" w:type="dxa"/>
+                <w:tcMar>
+                  <w:top w:w="20" w:type="nil"/>
+                  <w:left w:w="20" w:type="nil"/>
+                  <w:bottom w:w="20" w:type="nil"/>
+                  <w:right w:w="20" w:type="nil"/>
+                </w:tcMar>
+              </w:tcPr>
+              <w:p>
+                <w:pPr>
+                  <w:adjustRightInd w:val="0"/>
+                  <w:ind w:right="-461"/>
+                  <w:rPr>
+                    <w:rFonts w:ascii="Gill Sans MT" w:hAnsi="Gill Sans MT"/>
+                    <w:sz w:val="18"/>
+                  </w:rPr>
+                </w:pPr>
+                <w:r>
+                  <w:rPr>
+                    <w:rFonts w:ascii="Gill Sans MT" w:hAnsi="Gill Sans MT"/>
+                    <w:b/>
+                    <w:bCs/>
+                    <w:sz w:val="18"/>
+                  </w:rPr>
+                  <w:t>J</w:t>
+                </w:r>
+              </w:p>
+            </w:tc>
+            <w:tc>
+              <w:tcPr>
+                <w:tcW w:w="752" w:type="dxa"/>
+                <w:tcMar>
+                  <w:top w:w="20" w:type="nil"/>
+                  <w:left w:w="20" w:type="nil"/>
+                  <w:bottom w:w="20" w:type="nil"/>
+                  <w:right w:w="20" w:type="nil"/>
+                </w:tcMar>
+              </w:tcPr>
+              <w:p>
+                <w:pPr>
+                  <w:adjustRightInd w:val="0"/>
+                  <w:ind w:right="-755"/>
+                  <w:rPr>
+                    <w:rFonts w:ascii="Gill Sans MT" w:hAnsi="Gill Sans MT"/>
+                    <w:sz w:val="18"/>
+                  </w:rPr>
+                </w:pPr>
+                <w:r>
+                  <w:rPr>
+                    <w:rFonts w:ascii="Gill Sans MT" w:hAnsi="Gill Sans MT"/>
+                    <w:b/>
+                    <w:bCs/>
+                    <w:sz w:val="18"/>
+                  </w:rPr>
+                  <w:t>V</w:t>
+                </w:r>
+              </w:p>
+            </w:tc>
+            <w:tc>
+              <w:tcPr>
+                <w:tcW w:w="528" w:type="dxa"/>
+              </w:tcPr>
+              <w:p>
+                <w:pPr>
+                  <w:adjustRightInd w:val="0"/>
+                  <w:ind w:right="-461"/>
+                  <w:rPr>
+                    <w:rFonts w:ascii="Gill Sans MT" w:hAnsi="Gill Sans MT"/>
+                    <w:b/>
+                    <w:sz w:val="18"/>
+                  </w:rPr>
+                </w:pPr>
+                <w:r>
+                  <w:rPr>
+                    <w:rFonts w:ascii="Gill Sans MT" w:hAnsi="Gill Sans MT"/>
+                    <w:b/>
+                    <w:sz w:val="18"/>
+                  </w:rPr>
+                  <w:t>S</w:t>
+                </w:r>
+                <w:r>
+                  <w:rPr>
+                    <w:rFonts w:ascii="Gill Sans MT" w:hAnsi="Gill Sans MT"/>
+                    <w:b/>
+                    <w:sz w:val="18"/>
+                  </w:rPr>
+                  <w:t>*</w:t>
+                </w:r>
+              </w:p>
+            </w:tc>
+            <w:tc>
+              <w:tcPr>
+                <w:tcW w:w="1841" w:type="dxa"/>
+                <w:vMerge/>
+                <w:tcMar>
+                  <w:top w:w="20" w:type="nil"/>
+                  <w:left w:w="20" w:type="nil"/>
+                  <w:bottom w:w="20" w:type="nil"/>
+                  <w:right w:w="20" w:type="nil"/>
+                </w:tcMar>
+                <w:vAlign w:val="center"/>
+              </w:tcPr>
+              <w:p>
+                <w:pPr>
+                  <w:adjustRightInd w:val="0"/>
+                  <w:ind w:right="-461"/>
+                  <w:rPr>
+                    <w:rFonts w:ascii="Gill Sans MT" w:hAnsi="Gill Sans MT"/>
+                    <w:sz w:val="18"/>
+                  </w:rPr>
+                </w:pPr>
+              </w:p>
+            </w:tc>
+            <w:tc>
+              <w:tcPr>
+                <w:tcW w:w="577" w:type="dxa"/>
+                <w:vMerge/>
+                <w:tcMar>
+                  <w:top w:w="20" w:type="nil"/>
+                  <w:left w:w="20" w:type="nil"/>
+                  <w:bottom w:w="20" w:type="nil"/>
+                  <w:right w:w="20" w:type="nil"/>
+                </w:tcMar>
+                <w:vAlign w:val="center"/>
+              </w:tcPr>
+              <w:p>
+                <w:pPr>
+                  <w:adjustRightInd w:val="0"/>
+                  <w:ind w:right="-461"/>
+                  <w:rPr>
+                    <w:rFonts w:ascii="Gill Sans MT" w:hAnsi="Gill Sans MT"/>
+                    <w:sz w:val="18"/>
+                  </w:rPr>
+                </w:pPr>
+              </w:p>
+            </w:tc>
+          </w:tr>
+          <w:tr>
+            <w:trPr>
+              <w:trHeight w:val="348"/>
+            </w:trPr>
+            <w:tc>
+              <w:tcPr>
+                <w:tcW w:w="717" w:type="dxa"/>
+                <w:tcMar>
+                  <w:top w:w="20" w:type="nil"/>
+                  <w:left w:w="20" w:type="nil"/>
+                  <w:bottom w:w="20" w:type="nil"/>
+                  <w:right w:w="20" w:type="nil"/>
+                </w:tcMar>
+                <w:vAlign w:val="center"/>
+              </w:tcPr>
+              <w:p>
+                <w:pPr>
+                  <w:pStyle w:val="TableParagraph"/>
+                  <w:spacing w:line="193" w:lineRule="exact"/>
+                  <w:jc w:val="center"/>
+                  <w:rPr>
+                    <w:rFonts w:ascii="Gill Sans MT" w:hAnsi="Gill Sans MT"/>
+                    <w:sz w:val="18"/>
+                    <w:szCs w:val="18"/>
+                  </w:rPr>
+                </w:pPr>
+              </w:p>
+            </w:tc>
+            <w:tc>
+              <w:tcPr>
+                <w:tcW w:w="2167" w:type="dxa"/>
+                <w:tcMar>
+                  <w:top w:w="20" w:type="nil"/>
+                  <w:left w:w="20" w:type="nil"/>
+                  <w:bottom w:w="20" w:type="nil"/>
+                  <w:right w:w="20" w:type="nil"/>
+                </w:tcMar>
+                <w:vAlign w:val="center"/>
+              </w:tcPr>
+              <w:p>
+                <w:pPr>
+                  <w:pStyle w:val="TableParagraph"/>
+                  <w:spacing w:line="193" w:lineRule="exact"/>
+                  <w:jc w:val="center"/>
+                  <w:rPr>
+                    <w:rFonts w:ascii="Gill Sans MT" w:hAnsi="Gill Sans MT"/>
+                    <w:sz w:val="18"/>
+                    <w:szCs w:val="18"/>
+                  </w:rPr>
+                </w:pPr>
+              </w:p>
+            </w:tc>
+            <w:tc>
+              <w:tcPr>
+                <w:tcW w:w="884" w:type="dxa"/>
+                <w:tcMar>
+                  <w:top w:w="20" w:type="nil"/>
+                  <w:left w:w="20" w:type="nil"/>
+                  <w:bottom w:w="20" w:type="nil"/>
+                  <w:right w:w="20" w:type="nil"/>
+                </w:tcMar>
+                <w:vAlign w:val="center"/>
+              </w:tcPr>
+              <w:p>
+                <w:pPr>
+                  <w:pStyle w:val="TableParagraph"/>
+                  <w:spacing w:line="193" w:lineRule="exact"/>
+                  <w:jc w:val="center"/>
+                  <w:rPr>
+                    <w:rFonts w:ascii="Gill Sans MT" w:hAnsi="Gill Sans MT"/>
+                    <w:sz w:val="18"/>
+                    <w:szCs w:val="18"/>
+                  </w:rPr>
+                </w:pPr>
+              </w:p>
+            </w:tc>
+            <w:tc>
+              <w:tcPr>
+                <w:tcW w:w="647" w:type="dxa"/>
+                <w:tcMar>
+                  <w:top w:w="20" w:type="nil"/>
+                  <w:left w:w="20" w:type="nil"/>
+                  <w:bottom w:w="20" w:type="nil"/>
+                  <w:right w:w="20" w:type="nil"/>
+                </w:tcMar>
+                <w:vAlign w:val="center"/>
+              </w:tcPr>
+              <w:p>
+                <w:pPr>
+                  <w:pStyle w:val="TableParagraph"/>
+                  <w:spacing w:line="193" w:lineRule="exact"/>
+                  <w:jc w:val="center"/>
+                  <w:rPr>
+                    <w:rFonts w:ascii="Gill Sans MT" w:hAnsi="Gill Sans MT"/>
+                    <w:sz w:val="18"/>
+                    <w:szCs w:val="18"/>
+                  </w:rPr>
+                </w:pPr>
+              </w:p>
+            </w:tc>
+            <w:tc>
+              <w:tcPr>
+                <w:tcW w:w="722" w:type="dxa"/>
+                <w:tcMar>
+                  <w:top w:w="20" w:type="nil"/>
+                  <w:left w:w="20" w:type="nil"/>
+                  <w:bottom w:w="20" w:type="nil"/>
+                  <w:right w:w="20" w:type="nil"/>
+                </w:tcMar>
+                <w:vAlign w:val="center"/>
+              </w:tcPr>
+              <w:p>
+                <w:pPr>
+                  <w:pStyle w:val="TableParagraph"/>
+                  <w:spacing w:line="193" w:lineRule="exact"/>
+                  <w:jc w:val="center"/>
+                  <w:rPr>
+                    <w:rFonts w:ascii="Gill Sans MT" w:hAnsi="Gill Sans MT"/>
+                    <w:sz w:val="18"/>
+                    <w:szCs w:val="18"/>
+                  </w:rPr>
+                </w:pPr>
+              </w:p>
+            </w:tc>
+            <w:tc>
+              <w:tcPr>
+                <w:tcW w:w="721" w:type="dxa"/>
+                <w:tcMar>
+                  <w:top w:w="20" w:type="nil"/>
+                  <w:left w:w="20" w:type="nil"/>
+                  <w:bottom w:w="20" w:type="nil"/>
+                  <w:right w:w="20" w:type="nil"/>
+                </w:tcMar>
+                <w:vAlign w:val="center"/>
+              </w:tcPr>
+              <w:p>
+                <w:pPr>
+                  <w:pStyle w:val="TableParagraph"/>
+                  <w:spacing w:line="193" w:lineRule="exact"/>
+                  <w:jc w:val="center"/>
+                  <w:rPr>
+                    <w:rFonts w:ascii="Gill Sans MT" w:hAnsi="Gill Sans MT"/>
+                    <w:sz w:val="18"/>
+                    <w:szCs w:val="18"/>
+                  </w:rPr>
+                </w:pPr>
+              </w:p>
+            </w:tc>
+            <w:tc>
+              <w:tcPr>
+                <w:tcW w:w="722" w:type="dxa"/>
+                <w:tcMar>
+                  <w:top w:w="20" w:type="nil"/>
+                  <w:left w:w="20" w:type="nil"/>
+                  <w:bottom w:w="20" w:type="nil"/>
+                  <w:right w:w="20" w:type="nil"/>
+                </w:tcMar>
+                <w:vAlign w:val="center"/>
+              </w:tcPr>
+              <w:p>
+                <w:pPr>
+                  <w:pStyle w:val="TableParagraph"/>
+                  <w:spacing w:line="193" w:lineRule="exact"/>
+                  <w:jc w:val="center"/>
+                  <w:rPr>
+                    <w:rFonts w:ascii="Gill Sans MT" w:hAnsi="Gill Sans MT"/>
+                    <w:sz w:val="18"/>
+                    <w:szCs w:val="18"/>
+                  </w:rPr>
+                </w:pPr>
+              </w:p>
+            </w:tc>
+            <w:tc>
+              <w:tcPr>
+                <w:tcW w:w="722" w:type="dxa"/>
+                <w:tcMar>
+                  <w:top w:w="20" w:type="nil"/>
+                  <w:left w:w="20" w:type="nil"/>
+                  <w:bottom w:w="20" w:type="nil"/>
+                  <w:right w:w="20" w:type="nil"/>
+                </w:tcMar>
+                <w:vAlign w:val="center"/>
+              </w:tcPr>
+              <w:p>
+                <w:pPr>
+                  <w:pStyle w:val="TableParagraph"/>
+                  <w:spacing w:line="193" w:lineRule="exact"/>
+                  <w:jc w:val="center"/>
+                  <w:rPr>
+                    <w:rFonts w:ascii="Gill Sans MT" w:hAnsi="Gill Sans MT"/>
+                    <w:sz w:val="18"/>
+                    <w:szCs w:val="18"/>
+                  </w:rPr>
+                </w:pPr>
+              </w:p>
+            </w:tc>
+            <w:tc>
+              <w:tcPr>
+                <w:tcW w:w="752" w:type="dxa"/>
+                <w:tcMar>
+                  <w:top w:w="20" w:type="nil"/>
+                  <w:left w:w="20" w:type="nil"/>
+                  <w:bottom w:w="20" w:type="nil"/>
+                  <w:right w:w="20" w:type="nil"/>
+                </w:tcMar>
+                <w:vAlign w:val="center"/>
+              </w:tcPr>
+              <w:p>
+                <w:pPr>
+                  <w:pStyle w:val="TableParagraph"/>
+                  <w:spacing w:line="193" w:lineRule="exact"/>
+                  <w:jc w:val="center"/>
+                  <w:rPr>
+                    <w:rFonts w:ascii="Gill Sans MT" w:hAnsi="Gill Sans MT"/>
+                    <w:sz w:val="18"/>
+                    <w:szCs w:val="18"/>
+                  </w:rPr>
+                </w:pPr>
+              </w:p>
+            </w:tc>
+            <w:tc>
+              <w:tcPr>
+                <w:tcW w:w="528" w:type="dxa"/>
+              </w:tcPr>
+              <w:p>
+                <w:pPr>
+                  <w:pStyle w:val="TableParagraph"/>
+                  <w:spacing w:line="193" w:lineRule="exact"/>
+                  <w:jc w:val="center"/>
+                  <w:rPr>
+                    <w:rFonts w:ascii="Gill Sans MT" w:hAnsi="Gill Sans MT"/>
+                    <w:sz w:val="18"/>
+                    <w:szCs w:val="18"/>
+                  </w:rPr>
+                </w:pPr>
+              </w:p>
+            </w:tc>
+            <w:tc>
+              <w:tcPr>
+                <w:tcW w:w="1841" w:type="dxa"/>
+                <w:tcMar>
+                  <w:top w:w="20" w:type="nil"/>
+                  <w:left w:w="20" w:type="nil"/>
+                  <w:bottom w:w="20" w:type="nil"/>
+                  <w:right w:w="20" w:type="nil"/>
+                </w:tcMar>
+                <w:vAlign w:val="center"/>
+              </w:tcPr>
+              <w:p>
+                <w:pPr>
+                  <w:pStyle w:val="TableParagraph"/>
+                  <w:spacing w:line="193" w:lineRule="exact"/>
+                  <w:jc w:val="center"/>
+                  <w:rPr>
+                    <w:rFonts w:ascii="Gill Sans MT" w:hAnsi="Gill Sans MT"/>
+                    <w:sz w:val="18"/>
+                    <w:szCs w:val="18"/>
+                  </w:rPr>
+                </w:pPr>
+              </w:p>
+            </w:tc>
+            <w:tc>
+              <w:tcPr>
+                <w:tcW w:w="577" w:type="dxa"/>
+                <w:tcMar>
+                  <w:top w:w="20" w:type="nil"/>
+                  <w:left w:w="20" w:type="nil"/>
+                  <w:bottom w:w="20" w:type="nil"/>
+                  <w:right w:w="20" w:type="nil"/>
+                </w:tcMar>
+                <w:vAlign w:val="center"/>
+              </w:tcPr>
+              <w:p>
+                <w:pPr>
+                  <w:pStyle w:val="TableParagraph"/>
+                  <w:spacing w:line="193" w:lineRule="exact"/>
+                  <w:jc w:val="center"/>
+                  <w:rPr>
+                    <w:rFonts w:ascii="Gill Sans MT" w:hAnsi="Gill Sans MT"/>
+                    <w:sz w:val="18"/>
+                    <w:szCs w:val="18"/>
+                  </w:rPr>
+                </w:pPr>
+              </w:p>
+            </w:tc>
+          </w:tr>
+        </w:tbl>
+        <w:p>
+          <w:pPr>
+            <w:pStyle w:val="Sinespaciado"/>
+            <w:jc w:val="both"/>
+            <w:rPr>
+              <w:rFonts w:ascii="Gill Sans MT" w:hAnsi="Gill Sans MT" w:cs="Times New Roman"/>
+              <w:b/>
+              <w:bCs/>
+              <w:sz w:val="16"/>
+              <w:szCs w:val="16"/>
+              <w:lang w:val="es-ES"/>
+            </w:rPr>
+          </w:pPr>
           <w:r>
             <w:rPr>
-              <w:rFonts w:ascii="Arial" w:eastAsia="Courier New" w:hAnsi="Arial" w:cs="Arial"/>
+              <w:rFonts w:ascii="Gill Sans MT" w:hAnsi="Gill Sans MT" w:cs="Times New Roman"/>
+              <w:b/>
+              <w:bCs/>
+              <w:sz w:val="16"/>
+              <w:szCs w:val="16"/>
+              <w:lang w:val="es-ES"/>
+            </w:rPr>
+            <w:t>*SEA, CI</w:t>
+          </w:r>
+        </w:p>
+        <w:p>
+          <w:pPr>
+            <w:pStyle w:val="Sinespaciado"/>
+            <w:jc w:val="both"/>
+            <w:rPr>
+              <w:rFonts w:ascii="Gill Sans MT" w:hAnsi="Gill Sans MT" w:cs="Times New Roman"/>
+              <w:b/>
+              <w:bCs/>
+              <w:sz w:val="16"/>
+              <w:szCs w:val="16"/>
+              <w:lang w:val="es-ES"/>
+            </w:rPr>
+          </w:pPr>
+        </w:p>
+        <w:p>
+          <w:pPr>
+            <w:pStyle w:val="Sinespaciado"/>
+            <w:jc w:val="both"/>
+            <w:rPr>
+              <w:rFonts w:ascii="Arial" w:hAnsi="Arial" w:cs="Arial"/>
+              <w:b/>
+              <w:bCs/>
               <w:sz w:val="20"/>
               <w:szCs w:val="20"/>
-              <w:lang w:val="es-ES" w:bidi="es-ES"/>
+              <w:lang w:val="es-ES"/>
             </w:rPr>
-            <w:t>ProgramaEducativo</w:t>
-          </w:r>
-          <w:proofErr w:type="spellEnd"/>
+          </w:pPr>
           <w:r>
             <w:rPr>
-              <w:rFonts w:ascii="Arial" w:eastAsia="Courier New" w:hAnsi="Arial" w:cs="Arial"/>
+              <w:rFonts w:ascii="Arial" w:hAnsi="Arial" w:cs="Arial"/>
+              <w:b/>
+              <w:bCs/>
               <w:sz w:val="20"/>
               <w:szCs w:val="20"/>
-              <w:lang w:val="es-ES" w:bidi="es-ES"/>
+              <w:lang w:val="es-ES"/>
             </w:rPr>
-            <w:t>]</w:t>
+            <w:t>PERFIL ACADÉMICO</w:t>
           </w:r>
-        </w:sdtContent>
-      </w:sdt>
-    </w:p>
-    <w:p>
-      <w:pPr>
-        <w:pStyle w:val="Sinespaciado"/>
-        <w:jc w:val="both"/>
-        <w:rPr>
-          <w:rFonts w:ascii="Gill Sans MT" w:eastAsia="Courier New" w:hAnsi="Gill Sans MT" w:cs="Courier New"/>
-          <w:sz w:val="22"/>
-          <w:szCs w:val="22"/>
-          <w:lang w:val="es-ES" w:bidi="es-ES"/>
-        </w:rPr>
-      </w:pPr>
-    </w:p>
-    <w:p>
-      <w:pPr>
-        <w:pStyle w:val="Sinespaciado"/>
-        <w:jc w:val="both"/>
-        <w:rPr>
-          <w:rFonts w:ascii="Gill Sans MT" w:eastAsia="Courier New" w:hAnsi="Gill Sans MT" w:cs="Courier New"/>
-          <w:sz w:val="22"/>
-          <w:szCs w:val="22"/>
-          <w:lang w:val="es-ES" w:bidi="es-ES"/>
-        </w:rPr>
-      </w:pPr>
-    </w:p>
-    <w:tbl>
-      <w:tblPr>
-        <w:tblW w:w="11000" w:type="dxa"/>
-        <w:tblBorders>
-          <w:top w:val="single" w:sz="4" w:space="0" w:color="auto"/>
-          <w:left w:val="single" w:sz="4" w:space="0" w:color="auto"/>
-          <w:bottom w:val="single" w:sz="4" w:space="0" w:color="auto"/>
-          <w:right w:val="single" w:sz="4" w:space="0" w:color="auto"/>
-          <w:insideH w:val="single" w:sz="4" w:space="0" w:color="auto"/>
-          <w:insideV w:val="single" w:sz="4" w:space="0" w:color="auto"/>
-        </w:tblBorders>
-        <w:tblLayout w:type="fixed"/>
-        <w:tblLook w:val="0000" w:firstRow="0" w:lastRow="0" w:firstColumn="0" w:lastColumn="0" w:noHBand="0" w:noVBand="0"/>
-      </w:tblPr>
-      <w:tblGrid>
-        <w:gridCol w:w="717"/>
-        <w:gridCol w:w="2167"/>
-        <w:gridCol w:w="884"/>
-        <w:gridCol w:w="647"/>
-        <w:gridCol w:w="722"/>
-        <w:gridCol w:w="721"/>
-        <w:gridCol w:w="722"/>
-        <w:gridCol w:w="722"/>
-        <w:gridCol w:w="752"/>
-        <w:gridCol w:w="528"/>
-        <w:gridCol w:w="1841"/>
-        <w:gridCol w:w="577"/>
-      </w:tblGrid>
-      <w:tr>
-        <w:trPr>
-          <w:trHeight w:val="108"/>
-        </w:trPr>
-        <w:tc>
-          <w:tcPr>
-            <w:tcW w:w="717" w:type="dxa"/>
-            <w:vMerge w:val="restart"/>
-            <w:tcMar>
-              <w:top w:w="20" w:type="nil"/>
-              <w:left w:w="20" w:type="nil"/>
-              <w:bottom w:w="20" w:type="nil"/>
-              <w:right w:w="20" w:type="nil"/>
-            </w:tcMar>
-            <w:vAlign w:val="center"/>
-          </w:tcPr>
-          <w:p>
-            <w:pPr>
-              <w:adjustRightInd w:val="0"/>
-              <w:ind w:right="-459"/>
-              <w:rPr>
-                <w:rFonts w:ascii="Gill Sans MT" w:hAnsi="Gill Sans MT"/>
-                <w:sz w:val="16"/>
-              </w:rPr>
-            </w:pPr>
-            <w:r>
-              <w:rPr>
-                <w:rFonts w:ascii="Gill Sans MT" w:hAnsi="Gill Sans MT"/>
-                <w:b/>
-                <w:bCs/>
-                <w:sz w:val="16"/>
-              </w:rPr>
-              <w:t>Horas</w:t>
-            </w:r>
-          </w:p>
-        </w:tc>
-        <w:tc>
-          <w:tcPr>
-            <w:tcW w:w="2167" w:type="dxa"/>
-            <w:vMerge w:val="restart"/>
-            <w:tcMar>
-              <w:top w:w="20" w:type="nil"/>
-              <w:left w:w="20" w:type="nil"/>
-              <w:bottom w:w="20" w:type="nil"/>
-              <w:right w:w="20" w:type="nil"/>
-            </w:tcMar>
-            <w:vAlign w:val="center"/>
-          </w:tcPr>
-          <w:p>
-            <w:pPr>
-              <w:adjustRightInd w:val="0"/>
-              <w:ind w:right="40"/>
-              <w:jc w:val="center"/>
-              <w:rPr>
-                <w:rFonts w:ascii="Gill Sans MT" w:hAnsi="Gill Sans MT"/>
-                <w:sz w:val="16"/>
-              </w:rPr>
-            </w:pPr>
-            <w:r>
-              <w:rPr>
-                <w:rFonts w:ascii="Gill Sans MT" w:hAnsi="Gill Sans MT"/>
-                <w:b/>
-                <w:bCs/>
-                <w:sz w:val="16"/>
-              </w:rPr>
-              <w:t>Experiencia Educativa (EE)</w:t>
-            </w:r>
-          </w:p>
-        </w:tc>
-        <w:tc>
-          <w:tcPr>
-            <w:tcW w:w="884" w:type="dxa"/>
-            <w:vMerge w:val="restart"/>
-            <w:tcMar>
-              <w:top w:w="20" w:type="nil"/>
-              <w:left w:w="20" w:type="nil"/>
-              <w:bottom w:w="20" w:type="nil"/>
-              <w:right w:w="20" w:type="nil"/>
-            </w:tcMar>
-            <w:vAlign w:val="center"/>
-          </w:tcPr>
-          <w:p>
-            <w:pPr>
-              <w:adjustRightInd w:val="0"/>
-              <w:ind w:right="-461"/>
-              <w:rPr>
-                <w:rFonts w:ascii="Gill Sans MT" w:hAnsi="Gill Sans MT"/>
-                <w:sz w:val="16"/>
-              </w:rPr>
-            </w:pPr>
-            <w:r>
-              <w:rPr>
-                <w:rFonts w:ascii="Gill Sans MT" w:hAnsi="Gill Sans MT"/>
-                <w:b/>
-                <w:bCs/>
-                <w:sz w:val="16"/>
-              </w:rPr>
-              <w:t>NRC</w:t>
-            </w:r>
-          </w:p>
-        </w:tc>
-        <w:tc>
-          <w:tcPr>
-            <w:tcW w:w="647" w:type="dxa"/>
-            <w:vMerge w:val="restart"/>
-            <w:tcMar>
-              <w:top w:w="20" w:type="nil"/>
-              <w:left w:w="20" w:type="nil"/>
-              <w:bottom w:w="20" w:type="nil"/>
-              <w:right w:w="20" w:type="nil"/>
-            </w:tcMar>
-            <w:vAlign w:val="center"/>
-          </w:tcPr>
-          <w:p>
-            <w:pPr>
-              <w:adjustRightInd w:val="0"/>
-              <w:ind w:right="-461"/>
-              <w:jc w:val="both"/>
-              <w:rPr>
-                <w:rFonts w:ascii="Gill Sans MT" w:hAnsi="Gill Sans MT"/>
-                <w:sz w:val="16"/>
-              </w:rPr>
-            </w:pPr>
-            <w:r>
-              <w:rPr>
-                <w:rFonts w:ascii="Gill Sans MT" w:hAnsi="Gill Sans MT"/>
-                <w:b/>
-                <w:bCs/>
-                <w:sz w:val="16"/>
-              </w:rPr>
-              <w:t>Plaza</w:t>
-            </w:r>
-          </w:p>
-        </w:tc>
-        <w:tc>
-          <w:tcPr>
-            <w:tcW w:w="3639" w:type="dxa"/>
-            <w:gridSpan w:val="5"/>
-            <w:tcMar>
-              <w:top w:w="20" w:type="nil"/>
-              <w:left w:w="20" w:type="nil"/>
-              <w:bottom w:w="20" w:type="nil"/>
-              <w:right w:w="20" w:type="nil"/>
-            </w:tcMar>
-            <w:vAlign w:val="center"/>
-          </w:tcPr>
-          <w:p>
-            <w:pPr>
-              <w:adjustRightInd w:val="0"/>
-              <w:ind w:right="-461"/>
-              <w:jc w:val="center"/>
-              <w:rPr>
-                <w:rFonts w:ascii="Gill Sans MT" w:hAnsi="Gill Sans MT"/>
-                <w:sz w:val="18"/>
-              </w:rPr>
-            </w:pPr>
-            <w:r>
-              <w:rPr>
-                <w:rFonts w:ascii="Gill Sans MT" w:hAnsi="Gill Sans MT"/>
-                <w:b/>
-                <w:bCs/>
-                <w:sz w:val="18"/>
-              </w:rPr>
-              <w:t>Horario</w:t>
-            </w:r>
-          </w:p>
-        </w:tc>
-        <w:tc>
-          <w:tcPr>
-            <w:tcW w:w="528" w:type="dxa"/>
-          </w:tcPr>
-          <w:p>
-            <w:pPr>
-              <w:adjustRightInd w:val="0"/>
-              <w:ind w:right="-461"/>
-              <w:rPr>
-                <w:rFonts w:ascii="Gill Sans MT" w:hAnsi="Gill Sans MT"/>
-                <w:b/>
-                <w:bCs/>
-                <w:sz w:val="16"/>
-              </w:rPr>
-            </w:pPr>
-          </w:p>
-        </w:tc>
-        <w:tc>
-          <w:tcPr>
-            <w:tcW w:w="1841" w:type="dxa"/>
-            <w:vMerge w:val="restart"/>
-            <w:tcMar>
-              <w:top w:w="20" w:type="nil"/>
-              <w:left w:w="20" w:type="nil"/>
-              <w:bottom w:w="20" w:type="nil"/>
-              <w:right w:w="20" w:type="nil"/>
-            </w:tcMar>
-            <w:vAlign w:val="center"/>
-          </w:tcPr>
-          <w:p>
-            <w:pPr>
-              <w:adjustRightInd w:val="0"/>
-              <w:ind w:right="-461"/>
-              <w:rPr>
-                <w:rFonts w:ascii="Gill Sans MT" w:hAnsi="Gill Sans MT"/>
-                <w:sz w:val="16"/>
-              </w:rPr>
-            </w:pPr>
-            <w:r>
-              <w:rPr>
-                <w:rFonts w:ascii="Gill Sans MT" w:hAnsi="Gill Sans MT"/>
-                <w:b/>
-                <w:bCs/>
-                <w:sz w:val="16"/>
-              </w:rPr>
-              <w:t xml:space="preserve">   Tipo de Contratación</w:t>
-            </w:r>
-          </w:p>
-        </w:tc>
-        <w:tc>
-          <w:tcPr>
-            <w:tcW w:w="577" w:type="dxa"/>
-            <w:vMerge w:val="restart"/>
-            <w:tcMar>
-              <w:top w:w="20" w:type="nil"/>
-              <w:left w:w="20" w:type="nil"/>
-              <w:bottom w:w="20" w:type="nil"/>
-              <w:right w:w="20" w:type="nil"/>
-            </w:tcMar>
-            <w:vAlign w:val="center"/>
-          </w:tcPr>
-          <w:p>
-            <w:pPr>
-              <w:adjustRightInd w:val="0"/>
-              <w:ind w:right="-461"/>
-              <w:rPr>
-                <w:rFonts w:ascii="Gill Sans MT" w:hAnsi="Gill Sans MT"/>
-                <w:sz w:val="16"/>
-                <w:szCs w:val="16"/>
-              </w:rPr>
-            </w:pPr>
-            <w:r>
-              <w:rPr>
-                <w:rFonts w:ascii="Gill Sans MT" w:hAnsi="Gill Sans MT"/>
-                <w:b/>
-                <w:bCs/>
-                <w:sz w:val="16"/>
-                <w:szCs w:val="16"/>
-              </w:rPr>
-              <w:t>PA</w:t>
-            </w:r>
-          </w:p>
-        </w:tc>
-      </w:tr>
-      <w:tr>
-        <w:trPr>
-          <w:trHeight w:val="135"/>
-        </w:trPr>
-        <w:tc>
-          <w:tcPr>
-            <w:tcW w:w="717" w:type="dxa"/>
-            <w:vMerge/>
-            <w:tcMar>
-              <w:top w:w="20" w:type="nil"/>
-              <w:left w:w="20" w:type="nil"/>
-              <w:bottom w:w="20" w:type="nil"/>
-              <w:right w:w="20" w:type="nil"/>
-            </w:tcMar>
-            <w:vAlign w:val="center"/>
-          </w:tcPr>
-          <w:p>
-            <w:pPr>
-              <w:adjustRightInd w:val="0"/>
-              <w:ind w:right="-461"/>
-              <w:jc w:val="center"/>
-              <w:rPr>
-                <w:rFonts w:ascii="Gill Sans MT" w:hAnsi="Gill Sans MT"/>
-                <w:sz w:val="18"/>
-              </w:rPr>
-            </w:pPr>
-          </w:p>
-        </w:tc>
-        <w:tc>
-          <w:tcPr>
-            <w:tcW w:w="2167" w:type="dxa"/>
-            <w:vMerge/>
-            <w:tcMar>
-              <w:top w:w="20" w:type="nil"/>
-              <w:left w:w="20" w:type="nil"/>
-              <w:bottom w:w="20" w:type="nil"/>
-              <w:right w:w="20" w:type="nil"/>
-            </w:tcMar>
-            <w:vAlign w:val="center"/>
-          </w:tcPr>
-          <w:p>
-            <w:pPr>
-              <w:adjustRightInd w:val="0"/>
-              <w:ind w:right="40"/>
-              <w:rPr>
-                <w:rFonts w:ascii="Gill Sans MT" w:hAnsi="Gill Sans MT"/>
-                <w:sz w:val="18"/>
-              </w:rPr>
-            </w:pPr>
-          </w:p>
-        </w:tc>
-        <w:tc>
-          <w:tcPr>
-            <w:tcW w:w="884" w:type="dxa"/>
-            <w:vMerge/>
-            <w:tcMar>
-              <w:top w:w="20" w:type="nil"/>
-              <w:left w:w="20" w:type="nil"/>
-              <w:bottom w:w="20" w:type="nil"/>
-              <w:right w:w="20" w:type="nil"/>
-            </w:tcMar>
-            <w:vAlign w:val="center"/>
-          </w:tcPr>
-          <w:p>
-            <w:pPr>
-              <w:adjustRightInd w:val="0"/>
-              <w:ind w:right="-461"/>
-              <w:rPr>
-                <w:rFonts w:ascii="Gill Sans MT" w:hAnsi="Gill Sans MT"/>
-                <w:sz w:val="18"/>
-              </w:rPr>
-            </w:pPr>
-          </w:p>
-        </w:tc>
-        <w:tc>
-          <w:tcPr>
-            <w:tcW w:w="647" w:type="dxa"/>
-            <w:vMerge/>
-            <w:tcMar>
-              <w:top w:w="20" w:type="nil"/>
-              <w:left w:w="20" w:type="nil"/>
-              <w:bottom w:w="20" w:type="nil"/>
-              <w:right w:w="20" w:type="nil"/>
-            </w:tcMar>
-            <w:vAlign w:val="center"/>
-          </w:tcPr>
-          <w:p>
-            <w:pPr>
-              <w:adjustRightInd w:val="0"/>
-              <w:ind w:right="-461"/>
-              <w:rPr>
-                <w:rFonts w:ascii="Gill Sans MT" w:hAnsi="Gill Sans MT"/>
-                <w:sz w:val="18"/>
-              </w:rPr>
-            </w:pPr>
-          </w:p>
-        </w:tc>
-        <w:tc>
-          <w:tcPr>
-            <w:tcW w:w="722" w:type="dxa"/>
-            <w:tcMar>
-              <w:top w:w="20" w:type="nil"/>
-              <w:left w:w="20" w:type="nil"/>
-              <w:bottom w:w="20" w:type="nil"/>
-              <w:right w:w="20" w:type="nil"/>
-            </w:tcMar>
-          </w:tcPr>
-          <w:p>
-            <w:pPr>
-              <w:adjustRightInd w:val="0"/>
-              <w:ind w:right="-461"/>
-              <w:rPr>
-                <w:rFonts w:ascii="Gill Sans MT" w:hAnsi="Gill Sans MT"/>
-                <w:sz w:val="18"/>
-              </w:rPr>
-            </w:pPr>
-            <w:r>
-              <w:rPr>
-                <w:rFonts w:ascii="Gill Sans MT" w:hAnsi="Gill Sans MT"/>
-                <w:b/>
-                <w:bCs/>
-                <w:sz w:val="18"/>
-              </w:rPr>
-              <w:t>L</w:t>
-            </w:r>
-          </w:p>
-        </w:tc>
-        <w:tc>
-          <w:tcPr>
-            <w:tcW w:w="721" w:type="dxa"/>
-            <w:tcMar>
-              <w:top w:w="20" w:type="nil"/>
-              <w:left w:w="20" w:type="nil"/>
-              <w:bottom w:w="20" w:type="nil"/>
-              <w:right w:w="20" w:type="nil"/>
-            </w:tcMar>
-          </w:tcPr>
-          <w:p>
-            <w:pPr>
-              <w:adjustRightInd w:val="0"/>
-              <w:ind w:right="-461"/>
-              <w:rPr>
-                <w:rFonts w:ascii="Gill Sans MT" w:hAnsi="Gill Sans MT"/>
-                <w:sz w:val="18"/>
-              </w:rPr>
-            </w:pPr>
-            <w:r>
-              <w:rPr>
-                <w:rFonts w:ascii="Gill Sans MT" w:hAnsi="Gill Sans MT"/>
-                <w:b/>
-                <w:bCs/>
-                <w:sz w:val="18"/>
-              </w:rPr>
-              <w:t>M</w:t>
-            </w:r>
-          </w:p>
-        </w:tc>
-        <w:tc>
-          <w:tcPr>
-            <w:tcW w:w="722" w:type="dxa"/>
-            <w:tcMar>
-              <w:top w:w="20" w:type="nil"/>
-              <w:left w:w="20" w:type="nil"/>
-              <w:bottom w:w="20" w:type="nil"/>
-              <w:right w:w="20" w:type="nil"/>
-            </w:tcMar>
-          </w:tcPr>
-          <w:p>
-            <w:pPr>
-              <w:adjustRightInd w:val="0"/>
-              <w:ind w:right="-461"/>
-              <w:rPr>
-                <w:rFonts w:ascii="Gill Sans MT" w:hAnsi="Gill Sans MT"/>
-                <w:sz w:val="18"/>
-              </w:rPr>
-            </w:pPr>
-            <w:r>
-              <w:rPr>
-                <w:rFonts w:ascii="Gill Sans MT" w:hAnsi="Gill Sans MT"/>
-                <w:b/>
-                <w:bCs/>
-                <w:sz w:val="18"/>
-              </w:rPr>
-              <w:t>M</w:t>
-            </w:r>
-          </w:p>
-        </w:tc>
-        <w:tc>
-          <w:tcPr>
-            <w:tcW w:w="722" w:type="dxa"/>
-            <w:tcMar>
-              <w:top w:w="20" w:type="nil"/>
-              <w:left w:w="20" w:type="nil"/>
-              <w:bottom w:w="20" w:type="nil"/>
-              <w:right w:w="20" w:type="nil"/>
-            </w:tcMar>
-          </w:tcPr>
-          <w:p>
-            <w:pPr>
-              <w:adjustRightInd w:val="0"/>
-              <w:ind w:right="-461"/>
-              <w:rPr>
-                <w:rFonts w:ascii="Gill Sans MT" w:hAnsi="Gill Sans MT"/>
-                <w:sz w:val="18"/>
-              </w:rPr>
-            </w:pPr>
-            <w:r>
-              <w:rPr>
-                <w:rFonts w:ascii="Gill Sans MT" w:hAnsi="Gill Sans MT"/>
-                <w:b/>
-                <w:bCs/>
-                <w:sz w:val="18"/>
-              </w:rPr>
-              <w:t>J</w:t>
-            </w:r>
-          </w:p>
-        </w:tc>
-        <w:tc>
-          <w:tcPr>
-            <w:tcW w:w="752" w:type="dxa"/>
-            <w:tcMar>
-              <w:top w:w="20" w:type="nil"/>
-              <w:left w:w="20" w:type="nil"/>
-              <w:bottom w:w="20" w:type="nil"/>
-              <w:right w:w="20" w:type="nil"/>
-            </w:tcMar>
-          </w:tcPr>
-          <w:p>
-            <w:pPr>
-              <w:adjustRightInd w:val="0"/>
-              <w:ind w:right="-755"/>
-              <w:rPr>
-                <w:rFonts w:ascii="Gill Sans MT" w:hAnsi="Gill Sans MT"/>
-                <w:sz w:val="18"/>
-              </w:rPr>
-            </w:pPr>
-            <w:r>
-              <w:rPr>
-                <w:rFonts w:ascii="Gill Sans MT" w:hAnsi="Gill Sans MT"/>
-                <w:b/>
-                <w:bCs/>
-                <w:sz w:val="18"/>
-              </w:rPr>
-              <w:t>V</w:t>
-            </w:r>
-          </w:p>
-        </w:tc>
-        <w:tc>
-          <w:tcPr>
-            <w:tcW w:w="528" w:type="dxa"/>
-          </w:tcPr>
-          <w:p>
-            <w:pPr>
-              <w:adjustRightInd w:val="0"/>
-              <w:ind w:right="-461"/>
-              <w:rPr>
-                <w:rFonts w:ascii="Gill Sans MT" w:hAnsi="Gill Sans MT"/>
-                <w:b/>
-                <w:sz w:val="18"/>
-              </w:rPr>
-            </w:pPr>
-            <w:r>
-              <w:rPr>
-                <w:rFonts w:ascii="Gill Sans MT" w:hAnsi="Gill Sans MT"/>
-                <w:b/>
-                <w:sz w:val="18"/>
-              </w:rPr>
-              <w:t>S</w:t>
-            </w:r>
-            <w:r>
-              <w:rPr>
-                <w:rFonts w:ascii="Gill Sans MT" w:hAnsi="Gill Sans MT"/>
-                <w:b/>
-                <w:sz w:val="18"/>
-              </w:rPr>
-              <w:t>*</w:t>
-            </w:r>
-          </w:p>
-        </w:tc>
-        <w:tc>
-          <w:tcPr>
-            <w:tcW w:w="1841" w:type="dxa"/>
-            <w:vMerge/>
-            <w:tcMar>
-              <w:top w:w="20" w:type="nil"/>
-              <w:left w:w="20" w:type="nil"/>
-              <w:bottom w:w="20" w:type="nil"/>
-              <w:right w:w="20" w:type="nil"/>
-            </w:tcMar>
-            <w:vAlign w:val="center"/>
-          </w:tcPr>
-          <w:p>
-            <w:pPr>
-              <w:adjustRightInd w:val="0"/>
-              <w:ind w:right="-461"/>
-              <w:rPr>
-                <w:rFonts w:ascii="Gill Sans MT" w:hAnsi="Gill Sans MT"/>
-                <w:sz w:val="18"/>
-              </w:rPr>
-            </w:pPr>
-          </w:p>
-        </w:tc>
-        <w:tc>
-          <w:tcPr>
-            <w:tcW w:w="577" w:type="dxa"/>
-            <w:vMerge/>
-            <w:tcMar>
-              <w:top w:w="20" w:type="nil"/>
-              <w:left w:w="20" w:type="nil"/>
-              <w:bottom w:w="20" w:type="nil"/>
-              <w:right w:w="20" w:type="nil"/>
-            </w:tcMar>
-            <w:vAlign w:val="center"/>
-          </w:tcPr>
-          <w:p>
-            <w:pPr>
-              <w:adjustRightInd w:val="0"/>
-              <w:ind w:right="-461"/>
-              <w:rPr>
-                <w:rFonts w:ascii="Gill Sans MT" w:hAnsi="Gill Sans MT"/>
-                <w:sz w:val="18"/>
-              </w:rPr>
-            </w:pPr>
-          </w:p>
-        </w:tc>
-      </w:tr>
-      <w:tr>
-        <w:trPr>
-          <w:trHeight w:val="348"/>
-        </w:trPr>
-        <w:tc>
-          <w:tcPr>
-            <w:tcW w:w="717" w:type="dxa"/>
-            <w:tcMar>
-              <w:top w:w="20" w:type="nil"/>
-              <w:left w:w="20" w:type="nil"/>
-              <w:bottom w:w="20" w:type="nil"/>
-              <w:right w:w="20" w:type="nil"/>
-            </w:tcMar>
-            <w:vAlign w:val="center"/>
-          </w:tcPr>
-          <w:p>
-            <w:pPr>
-              <w:pStyle w:val="TableParagraph"/>
-              <w:spacing w:line="193" w:lineRule="exact"/>
-              <w:jc w:val="center"/>
-              <w:rPr>
-                <w:rFonts w:ascii="Gill Sans MT" w:hAnsi="Gill Sans MT"/>
-                <w:sz w:val="18"/>
-                <w:szCs w:val="18"/>
-              </w:rPr>
-            </w:pPr>
-          </w:p>
-        </w:tc>
-        <w:tc>
-          <w:tcPr>
-            <w:tcW w:w="2167" w:type="dxa"/>
-            <w:tcMar>
-              <w:top w:w="20" w:type="nil"/>
-              <w:left w:w="20" w:type="nil"/>
-              <w:bottom w:w="20" w:type="nil"/>
-              <w:right w:w="20" w:type="nil"/>
-            </w:tcMar>
-            <w:vAlign w:val="center"/>
-          </w:tcPr>
-          <w:p>
-            <w:pPr>
-              <w:pStyle w:val="TableParagraph"/>
-              <w:spacing w:line="193" w:lineRule="exact"/>
-              <w:jc w:val="center"/>
-              <w:rPr>
-                <w:rFonts w:ascii="Gill Sans MT" w:hAnsi="Gill Sans MT"/>
-                <w:sz w:val="18"/>
-                <w:szCs w:val="18"/>
-              </w:rPr>
-            </w:pPr>
-          </w:p>
-        </w:tc>
-        <w:tc>
-          <w:tcPr>
-            <w:tcW w:w="884" w:type="dxa"/>
-            <w:tcMar>
-              <w:top w:w="20" w:type="nil"/>
-              <w:left w:w="20" w:type="nil"/>
-              <w:bottom w:w="20" w:type="nil"/>
-              <w:right w:w="20" w:type="nil"/>
-            </w:tcMar>
-            <w:vAlign w:val="center"/>
-          </w:tcPr>
-          <w:p>
-            <w:pPr>
-              <w:pStyle w:val="TableParagraph"/>
-              <w:spacing w:line="193" w:lineRule="exact"/>
-              <w:jc w:val="center"/>
-              <w:rPr>
-                <w:rFonts w:ascii="Gill Sans MT" w:hAnsi="Gill Sans MT"/>
-                <w:sz w:val="18"/>
-                <w:szCs w:val="18"/>
-              </w:rPr>
-            </w:pPr>
-          </w:p>
-        </w:tc>
-        <w:tc>
-          <w:tcPr>
-            <w:tcW w:w="647" w:type="dxa"/>
-            <w:tcMar>
-              <w:top w:w="20" w:type="nil"/>
-              <w:left w:w="20" w:type="nil"/>
-              <w:bottom w:w="20" w:type="nil"/>
-              <w:right w:w="20" w:type="nil"/>
-            </w:tcMar>
-            <w:vAlign w:val="center"/>
-          </w:tcPr>
-          <w:p>
-            <w:pPr>
-              <w:pStyle w:val="TableParagraph"/>
-              <w:spacing w:line="193" w:lineRule="exact"/>
-              <w:jc w:val="center"/>
-              <w:rPr>
-                <w:rFonts w:ascii="Gill Sans MT" w:hAnsi="Gill Sans MT"/>
-                <w:sz w:val="18"/>
-                <w:szCs w:val="18"/>
-              </w:rPr>
-            </w:pPr>
-          </w:p>
-        </w:tc>
-        <w:tc>
-          <w:tcPr>
-            <w:tcW w:w="722" w:type="dxa"/>
-            <w:tcMar>
-              <w:top w:w="20" w:type="nil"/>
-              <w:left w:w="20" w:type="nil"/>
-              <w:bottom w:w="20" w:type="nil"/>
-              <w:right w:w="20" w:type="nil"/>
-            </w:tcMar>
-            <w:vAlign w:val="center"/>
-          </w:tcPr>
-          <w:p>
-            <w:pPr>
-              <w:pStyle w:val="TableParagraph"/>
-              <w:spacing w:line="193" w:lineRule="exact"/>
-              <w:jc w:val="center"/>
-              <w:rPr>
-                <w:rFonts w:ascii="Gill Sans MT" w:hAnsi="Gill Sans MT"/>
-                <w:sz w:val="18"/>
-                <w:szCs w:val="18"/>
-              </w:rPr>
-            </w:pPr>
-          </w:p>
-        </w:tc>
-        <w:tc>
-          <w:tcPr>
-            <w:tcW w:w="721" w:type="dxa"/>
-            <w:tcMar>
-              <w:top w:w="20" w:type="nil"/>
-              <w:left w:w="20" w:type="nil"/>
-              <w:bottom w:w="20" w:type="nil"/>
-              <w:right w:w="20" w:type="nil"/>
-            </w:tcMar>
-            <w:vAlign w:val="center"/>
-          </w:tcPr>
-          <w:p>
-            <w:pPr>
-              <w:pStyle w:val="TableParagraph"/>
-              <w:spacing w:line="193" w:lineRule="exact"/>
-              <w:jc w:val="center"/>
-              <w:rPr>
-                <w:rFonts w:ascii="Gill Sans MT" w:hAnsi="Gill Sans MT"/>
-                <w:sz w:val="18"/>
-                <w:szCs w:val="18"/>
-              </w:rPr>
-            </w:pPr>
-          </w:p>
-        </w:tc>
-        <w:tc>
-          <w:tcPr>
-            <w:tcW w:w="722" w:type="dxa"/>
-            <w:tcMar>
-              <w:top w:w="20" w:type="nil"/>
-              <w:left w:w="20" w:type="nil"/>
-              <w:bottom w:w="20" w:type="nil"/>
-              <w:right w:w="20" w:type="nil"/>
-            </w:tcMar>
-            <w:vAlign w:val="center"/>
-          </w:tcPr>
-          <w:p>
-            <w:pPr>
-              <w:pStyle w:val="TableParagraph"/>
-              <w:spacing w:line="193" w:lineRule="exact"/>
-              <w:jc w:val="center"/>
-              <w:rPr>
-                <w:rFonts w:ascii="Gill Sans MT" w:hAnsi="Gill Sans MT"/>
-                <w:sz w:val="18"/>
-                <w:szCs w:val="18"/>
-              </w:rPr>
-            </w:pPr>
-          </w:p>
-        </w:tc>
-        <w:tc>
-          <w:tcPr>
-            <w:tcW w:w="722" w:type="dxa"/>
-            <w:tcMar>
-              <w:top w:w="20" w:type="nil"/>
-              <w:left w:w="20" w:type="nil"/>
-              <w:bottom w:w="20" w:type="nil"/>
-              <w:right w:w="20" w:type="nil"/>
-            </w:tcMar>
-            <w:vAlign w:val="center"/>
-          </w:tcPr>
-          <w:p>
-            <w:pPr>
-              <w:pStyle w:val="TableParagraph"/>
-              <w:spacing w:line="193" w:lineRule="exact"/>
-              <w:jc w:val="center"/>
-              <w:rPr>
-                <w:rFonts w:ascii="Gill Sans MT" w:hAnsi="Gill Sans MT"/>
-                <w:sz w:val="18"/>
-                <w:szCs w:val="18"/>
-              </w:rPr>
-            </w:pPr>
-          </w:p>
-        </w:tc>
-        <w:tc>
-          <w:tcPr>
-            <w:tcW w:w="752" w:type="dxa"/>
-            <w:tcMar>
-              <w:top w:w="20" w:type="nil"/>
-              <w:left w:w="20" w:type="nil"/>
-              <w:bottom w:w="20" w:type="nil"/>
-              <w:right w:w="20" w:type="nil"/>
-            </w:tcMar>
-            <w:vAlign w:val="center"/>
-          </w:tcPr>
-          <w:p>
-            <w:pPr>
-              <w:pStyle w:val="TableParagraph"/>
-              <w:spacing w:line="193" w:lineRule="exact"/>
-              <w:jc w:val="center"/>
-              <w:rPr>
-                <w:rFonts w:ascii="Gill Sans MT" w:hAnsi="Gill Sans MT"/>
-                <w:sz w:val="18"/>
-                <w:szCs w:val="18"/>
-              </w:rPr>
-            </w:pPr>
-          </w:p>
-        </w:tc>
-        <w:tc>
-          <w:tcPr>
-            <w:tcW w:w="528" w:type="dxa"/>
-          </w:tcPr>
-          <w:p>
-            <w:pPr>
-              <w:pStyle w:val="TableParagraph"/>
-              <w:spacing w:line="193" w:lineRule="exact"/>
-              <w:jc w:val="center"/>
-              <w:rPr>
-                <w:rFonts w:ascii="Gill Sans MT" w:hAnsi="Gill Sans MT"/>
-                <w:sz w:val="18"/>
-                <w:szCs w:val="18"/>
-              </w:rPr>
-            </w:pPr>
-          </w:p>
-        </w:tc>
-        <w:tc>
-          <w:tcPr>
-            <w:tcW w:w="1841" w:type="dxa"/>
-            <w:tcMar>
-              <w:top w:w="20" w:type="nil"/>
-              <w:left w:w="20" w:type="nil"/>
-              <w:bottom w:w="20" w:type="nil"/>
-              <w:right w:w="20" w:type="nil"/>
-            </w:tcMar>
-            <w:vAlign w:val="center"/>
-          </w:tcPr>
-          <w:p>
-            <w:pPr>
-              <w:pStyle w:val="TableParagraph"/>
-              <w:spacing w:line="193" w:lineRule="exact"/>
-              <w:jc w:val="center"/>
-              <w:rPr>
-                <w:rFonts w:ascii="Gill Sans MT" w:hAnsi="Gill Sans MT"/>
-                <w:sz w:val="18"/>
-                <w:szCs w:val="18"/>
-              </w:rPr>
-            </w:pPr>
-          </w:p>
-        </w:tc>
-        <w:tc>
-          <w:tcPr>
-            <w:tcW w:w="577" w:type="dxa"/>
-            <w:tcMar>
-              <w:top w:w="20" w:type="nil"/>
-              <w:left w:w="20" w:type="nil"/>
-              <w:bottom w:w="20" w:type="nil"/>
-              <w:right w:w="20" w:type="nil"/>
-            </w:tcMar>
-            <w:vAlign w:val="center"/>
-          </w:tcPr>
-          <w:p>
-            <w:pPr>
-              <w:pStyle w:val="TableParagraph"/>
-              <w:spacing w:line="193" w:lineRule="exact"/>
-              <w:jc w:val="center"/>
-              <w:rPr>
-                <w:rFonts w:ascii="Gill Sans MT" w:hAnsi="Gill Sans MT"/>
-                <w:sz w:val="18"/>
-                <w:szCs w:val="18"/>
-              </w:rPr>
-            </w:pPr>
-          </w:p>
-        </w:tc>
-      </w:tr>
-    </w:tbl>
-    <w:p>
-      <w:pPr>
-        <w:pStyle w:val="Sinespaciado"/>
-        <w:jc w:val="both"/>
-        <w:rPr>
-          <w:rFonts w:ascii="Gill Sans MT" w:hAnsi="Gill Sans MT" w:cs="Times New Roman"/>
-          <w:b/>
-          <w:bCs/>
-          <w:sz w:val="16"/>
-          <w:szCs w:val="16"/>
-          <w:lang w:val="es-ES"/>
-        </w:rPr>
-      </w:pPr>
-      <w:r>
-        <w:rPr>
-          <w:rFonts w:ascii="Gill Sans MT" w:hAnsi="Gill Sans MT" w:cs="Times New Roman"/>
-          <w:b/>
-          <w:bCs/>
-          <w:sz w:val="16"/>
-          <w:szCs w:val="16"/>
-          <w:lang w:val="es-ES"/>
-        </w:rPr>
-        <w:t>*SEA, CI</w:t>
-      </w:r>
-    </w:p>
-    <w:p>
-      <w:pPr>
-        <w:pStyle w:val="Sinespaciado"/>
-        <w:jc w:val="both"/>
-        <w:rPr>
-          <w:rFonts w:ascii="Gill Sans MT" w:hAnsi="Gill Sans MT" w:cs="Times New Roman"/>
-          <w:b/>
-          <w:bCs/>
-          <w:sz w:val="16"/>
-          <w:szCs w:val="16"/>
-          <w:lang w:val="es-ES"/>
-        </w:rPr>
-      </w:pPr>
-    </w:p>
-    <w:p>
-      <w:pPr>
-        <w:pStyle w:val="Sinespaciado"/>
-        <w:jc w:val="both"/>
-        <w:rPr>
-          <w:rFonts w:ascii="Arial" w:hAnsi="Arial" w:cs="Arial"/>
-          <w:b/>
-          <w:bCs/>
-          <w:sz w:val="20"/>
-          <w:szCs w:val="20"/>
-          <w:lang w:val="es-ES"/>
-        </w:rPr>
-      </w:pPr>
-      <w:r>
-        <w:rPr>
-          <w:rFonts w:ascii="Arial" w:hAnsi="Arial" w:cs="Arial"/>
-          <w:b/>
-          <w:bCs/>
-          <w:sz w:val="20"/>
-          <w:szCs w:val="20"/>
-          <w:lang w:val="es-ES"/>
-        </w:rPr>
-        <w:t>PERFIL ACADÉMICO</w:t>
-      </w:r>
-      <w:r>
-        <w:rPr>
-          <w:rFonts w:ascii="Arial" w:hAnsi="Arial" w:cs="Arial"/>
-          <w:b/>
-          <w:bCs/>
-          <w:sz w:val="20"/>
-          <w:szCs w:val="20"/>
-          <w:lang w:val="es-ES"/>
-        </w:rPr>
-        <w:t>:</w:t>
-      </w:r>
-    </w:p>
-    <w:p>
-      <w:pPr>
-        <w:pStyle w:val="Sinespaciado"/>
-        <w:jc w:val="both"/>
-        <w:rPr>
-          <w:rFonts w:ascii="Arial" w:hAnsi="Arial" w:cs="Arial"/>
-          <w:b/>
-          <w:bCs/>
-          <w:sz w:val="20"/>
-          <w:szCs w:val="20"/>
-          <w:lang w:val="es-ES"/>
-        </w:rPr>
-      </w:pPr>
-    </w:p>
-    <w:sdt>
-      <w:sdtPr>
-        <w:rPr>
-          <w:rFonts w:ascii="Arial" w:hAnsi="Arial" w:cs="Arial"/>
-          <w:b/>
-          <w:bCs/>
-          <w:sz w:val="20"/>
-          <w:szCs w:val="20"/>
-          <w:lang w:val="es-ES"/>
-        </w:rPr>
-        <w:tag w:val="ListaPerfiles"/>
-        <w:id w:val="-1729675421"/>
-        <w:placeholder>
-          <w:docPart w:val="DefaultPlaceholder_-1854013440"/>
-        </w:placeholder>
-      </w:sdtPr>
-      <w:sdtEndPr>
-        <w:rPr>
-          <w:b w:val="0"/>
-          <w:bCs w:val="0"/>
-          <w:lang w:val="es-ES_tradnl"/>
-        </w:rPr>
-      </w:sdtEndPr>
-      <w:sdtContent>
+          <w:r>
+            <w:rPr>
+              <w:rFonts w:ascii="Arial" w:hAnsi="Arial" w:cs="Arial"/>
+              <w:b/>
+              <w:bCs/>
+              <w:sz w:val="20"/>
+              <w:szCs w:val="20"/>
+              <w:lang w:val="es-ES"/>
+            </w:rPr>
+            <w:t>:</w:t>
+          </w:r>
+        </w:p>
+        <w:p>
+          <w:pPr>
+            <w:pStyle w:val="Sinespaciado"/>
+            <w:jc w:val="both"/>
+            <w:rPr>
+              <w:rFonts w:ascii="Arial" w:hAnsi="Arial" w:cs="Arial"/>
+              <w:b/>
+              <w:bCs/>
+              <w:sz w:val="20"/>
+              <w:szCs w:val="20"/>
+              <w:lang w:val="es-ES"/>
+            </w:rPr>
+          </w:pPr>
+        </w:p>
         <w:sdt>
           <w:sdtPr>
             <w:rPr>
@@ -2074,22 +2035,22 @@
               <w:szCs w:val="20"/>
               <w:lang w:val="es-ES"/>
             </w:rPr>
-            <w:tag w:val="NombreExperiencia"/>
-            <w:id w:val="1023437705"/>
+            <w:tag w:val="ListaPerfiles"/>
+            <w:id w:val="-1729675421"/>
             <w:placeholder>
               <w:docPart w:val="DefaultPlaceholder_-1854013440"/>
             </w:placeholder>
-            <w:text/>
           </w:sdtPr>
+          <w:sdtEndPr>
+            <w:rPr>
+              <w:b w:val="0"/>
+              <w:bCs w:val="0"/>
+              <w:lang w:val="es-ES_tradnl"/>
+            </w:rPr>
+          </w:sdtEndPr>
           <w:sdtContent>
-            <w:p>
-              <w:pPr>
-                <w:pStyle w:val="Sinespaciado"/>
-                <w:numPr>
-                  <w:ilvl w:val="0"/>
-                  <w:numId w:val="12"/>
-                </w:numPr>
-                <w:jc w:val="both"/>
+            <w:sdt>
+              <w:sdtPr>
                 <w:rPr>
                   <w:rFonts w:ascii="Arial" w:hAnsi="Arial" w:cs="Arial"/>
                   <w:b/>
@@ -2098,101 +2059,127 @@
                   <w:szCs w:val="20"/>
                   <w:lang w:val="es-ES"/>
                 </w:rPr>
-              </w:pPr>
-              <w:r>
-                <w:rPr>
-                  <w:rFonts w:ascii="Arial" w:hAnsi="Arial" w:cs="Arial"/>
-                  <w:b/>
-                  <w:bCs/>
-                  <w:sz w:val="20"/>
-                  <w:szCs w:val="20"/>
-                  <w:lang w:val="es-ES"/>
-                </w:rPr>
-                <w:t>[</w:t>
-              </w:r>
-              <w:proofErr w:type="spellStart"/>
-              <w:r>
-                <w:rPr>
-                  <w:rFonts w:ascii="Arial" w:hAnsi="Arial" w:cs="Arial"/>
-                  <w:b/>
-                  <w:bCs/>
-                  <w:sz w:val="20"/>
-                  <w:szCs w:val="20"/>
-                  <w:lang w:val="es-ES"/>
-                </w:rPr>
-                <w:t>NombreExperiencia</w:t>
-              </w:r>
-              <w:proofErr w:type="spellEnd"/>
-              <w:r>
-                <w:rPr>
-                  <w:rFonts w:ascii="Arial" w:hAnsi="Arial" w:cs="Arial"/>
-                  <w:b/>
-                  <w:bCs/>
-                  <w:sz w:val="20"/>
-                  <w:szCs w:val="20"/>
-                  <w:lang w:val="es-ES"/>
-                </w:rPr>
-                <w:t>]</w:t>
-              </w:r>
-            </w:p>
-          </w:sdtContent>
-        </w:sdt>
-        <w:sdt>
-          <w:sdtPr>
-            <w:rPr>
-              <w:rFonts w:ascii="Arial" w:hAnsi="Arial" w:cs="Arial"/>
-              <w:sz w:val="20"/>
-              <w:szCs w:val="20"/>
-            </w:rPr>
-            <w:tag w:val="PerfilDocente"/>
-            <w:id w:val="634060200"/>
-            <w:placeholder>
-              <w:docPart w:val="DefaultPlaceholder_-1854013440"/>
-            </w:placeholder>
-            <w:text/>
-          </w:sdtPr>
-          <w:sdtContent>
-            <w:p>
-              <w:pPr>
-                <w:pStyle w:val="Sinespaciado"/>
-                <w:ind w:left="720"/>
-                <w:jc w:val="both"/>
-                <w:rPr>
-                  <w:rFonts w:ascii="Arial" w:hAnsi="Arial" w:cs="Arial"/>
-                  <w:b/>
-                  <w:bCs/>
-                  <w:sz w:val="20"/>
-                  <w:szCs w:val="20"/>
-                  <w:lang w:val="es-ES"/>
-                </w:rPr>
-              </w:pPr>
-              <w:r>
+                <w:tag w:val="NombreExperiencia"/>
+                <w:id w:val="1023437705"/>
+                <w:placeholder>
+                  <w:docPart w:val="DefaultPlaceholder_-1854013440"/>
+                </w:placeholder>
+                <w:text/>
+              </w:sdtPr>
+              <w:sdtContent>
+                <w:p>
+                  <w:pPr>
+                    <w:pStyle w:val="Sinespaciado"/>
+                    <w:numPr>
+                      <w:ilvl w:val="0"/>
+                      <w:numId w:val="12"/>
+                    </w:numPr>
+                    <w:jc w:val="both"/>
+                    <w:rPr>
+                      <w:rFonts w:ascii="Arial" w:hAnsi="Arial" w:cs="Arial"/>
+                      <w:b/>
+                      <w:bCs/>
+                      <w:sz w:val="20"/>
+                      <w:szCs w:val="20"/>
+                      <w:lang w:val="es-ES"/>
+                    </w:rPr>
+                  </w:pPr>
+                  <w:r>
+                    <w:rPr>
+                      <w:rFonts w:ascii="Arial" w:hAnsi="Arial" w:cs="Arial"/>
+                      <w:b/>
+                      <w:bCs/>
+                      <w:sz w:val="20"/>
+                      <w:szCs w:val="20"/>
+                      <w:lang w:val="es-ES"/>
+                    </w:rPr>
+                    <w:t>[</w:t>
+                  </w:r>
+                  <w:proofErr w:type="spellStart"/>
+                  <w:r>
+                    <w:rPr>
+                      <w:rFonts w:ascii="Arial" w:hAnsi="Arial" w:cs="Arial"/>
+                      <w:b/>
+                      <w:bCs/>
+                      <w:sz w:val="20"/>
+                      <w:szCs w:val="20"/>
+                      <w:lang w:val="es-ES"/>
+                    </w:rPr>
+                    <w:t>NombreExperiencia</w:t>
+                  </w:r>
+                  <w:proofErr w:type="spellEnd"/>
+                  <w:r>
+                    <w:rPr>
+                      <w:rFonts w:ascii="Arial" w:hAnsi="Arial" w:cs="Arial"/>
+                      <w:b/>
+                      <w:bCs/>
+                      <w:sz w:val="20"/>
+                      <w:szCs w:val="20"/>
+                      <w:lang w:val="es-ES"/>
+                    </w:rPr>
+                    <w:t>]</w:t>
+                  </w:r>
+                </w:p>
+              </w:sdtContent>
+            </w:sdt>
+            <w:sdt>
+              <w:sdtPr>
                 <w:rPr>
                   <w:rFonts w:ascii="Arial" w:hAnsi="Arial" w:cs="Arial"/>
                   <w:sz w:val="20"/>
                   <w:szCs w:val="20"/>
                 </w:rPr>
-                <w:t>[</w:t>
-              </w:r>
-              <w:proofErr w:type="spellStart"/>
-              <w:r>
-                <w:rPr>
-                  <w:rFonts w:ascii="Arial" w:hAnsi="Arial" w:cs="Arial"/>
-                  <w:sz w:val="20"/>
-                  <w:szCs w:val="20"/>
-                </w:rPr>
-                <w:t>PerfilDocente</w:t>
-              </w:r>
-              <w:proofErr w:type="spellEnd"/>
-              <w:r>
-                <w:rPr>
-                  <w:rFonts w:ascii="Arial" w:hAnsi="Arial" w:cs="Arial"/>
-                  <w:sz w:val="20"/>
-                  <w:szCs w:val="20"/>
-                </w:rPr>
-                <w:t>]</w:t>
-              </w:r>
-            </w:p>
+                <w:tag w:val="PerfilDocente"/>
+                <w:id w:val="634060200"/>
+                <w:placeholder>
+                  <w:docPart w:val="DefaultPlaceholder_-1854013440"/>
+                </w:placeholder>
+                <w:text/>
+              </w:sdtPr>
+              <w:sdtContent>
+                <w:p>
+                  <w:pPr>
+                    <w:pStyle w:val="Sinespaciado"/>
+                    <w:ind w:left="720"/>
+                    <w:jc w:val="both"/>
+                    <w:rPr>
+                      <w:rFonts w:ascii="Arial" w:hAnsi="Arial" w:cs="Arial"/>
+                      <w:b/>
+                      <w:bCs/>
+                      <w:sz w:val="20"/>
+                      <w:szCs w:val="20"/>
+                      <w:lang w:val="es-ES"/>
+                    </w:rPr>
+                  </w:pPr>
+                  <w:r>
+                    <w:rPr>
+                      <w:rFonts w:ascii="Arial" w:hAnsi="Arial" w:cs="Arial"/>
+                      <w:sz w:val="20"/>
+                      <w:szCs w:val="20"/>
+                    </w:rPr>
+                    <w:t>[</w:t>
+                  </w:r>
+                  <w:proofErr w:type="spellStart"/>
+                  <w:r>
+                    <w:rPr>
+                      <w:rFonts w:ascii="Arial" w:hAnsi="Arial" w:cs="Arial"/>
+                      <w:sz w:val="20"/>
+                      <w:szCs w:val="20"/>
+                    </w:rPr>
+                    <w:t>PerfilDocente</w:t>
+                  </w:r>
+                  <w:proofErr w:type="spellEnd"/>
+                  <w:r>
+                    <w:rPr>
+                      <w:rFonts w:ascii="Arial" w:hAnsi="Arial" w:cs="Arial"/>
+                      <w:sz w:val="20"/>
+                      <w:szCs w:val="20"/>
+                    </w:rPr>
+                    <w:t>]</w:t>
+                  </w:r>
+                </w:p>
+              </w:sdtContent>
+            </w:sdt>
           </w:sdtContent>
         </w:sdt>
       </w:sdtContent>
@@ -3526,16 +3513,6 @@
         </w:rPr>
         <w:t>, deberán entregar todos los documentos mencionados en los requisitos de participación los días</w:t>
       </w:r>
-      <w:r>
-        <w:rPr>
-          <w:rFonts w:ascii="Arial" w:hAnsi="Arial" w:cs="Arial"/>
-          <w:b/>
-          <w:bCs/>
-          <w:sz w:val="20"/>
-          <w:szCs w:val="20"/>
-        </w:rPr>
-        <w:t xml:space="preserve"> </w:t>
-      </w:r>
       <w:sdt>
         <w:sdtPr>
           <w:rPr>
@@ -3543,7 +3520,7 @@
             <w:sz w:val="20"/>
             <w:szCs w:val="20"/>
           </w:rPr>
-          <w:tag w:val="DiasAceptacion"/>
+          <w:tag w:val="HorarioAceptacion"/>
           <w:id w:val="-2074810006"/>
           <w:placeholder>
             <w:docPart w:val="DefaultPlaceholder_-1854013440"/>
@@ -3566,7 +3543,7 @@
               <w:sz w:val="20"/>
               <w:szCs w:val="20"/>
             </w:rPr>
-            <w:t>DiasAceptacion</w:t>
+            <w:t>HorarioAceptacion</w:t>
           </w:r>
           <w:proofErr w:type="spellEnd"/>
           <w:r>
@@ -3582,68 +3559,10 @@
       <w:r>
         <w:rPr>
           <w:rFonts w:ascii="Arial" w:hAnsi="Arial" w:cs="Arial"/>
-          <w:b/>
-          <w:bCs/>
-          <w:sz w:val="20"/>
-          <w:szCs w:val="20"/>
-        </w:rPr>
-        <w:t xml:space="preserve"> </w:t>
-      </w:r>
-      <w:r>
-        <w:rPr>
-          <w:rFonts w:ascii="Arial" w:hAnsi="Arial" w:cs="Arial"/>
-          <w:sz w:val="20"/>
-          <w:szCs w:val="20"/>
-        </w:rPr>
-        <w:t>en horario de 10</w:t>
-      </w:r>
-      <w:r>
-        <w:rPr>
-          <w:rFonts w:ascii="Arial" w:hAnsi="Arial" w:cs="Arial"/>
-          <w:sz w:val="20"/>
-          <w:szCs w:val="20"/>
-        </w:rPr>
-        <w:t>:</w:t>
-      </w:r>
-      <w:r>
-        <w:rPr>
-          <w:rFonts w:ascii="Arial" w:hAnsi="Arial" w:cs="Arial"/>
-          <w:sz w:val="20"/>
-          <w:szCs w:val="20"/>
-        </w:rPr>
-        <w:t>00 a 14:00 horas y de 1</w:t>
-      </w:r>
-      <w:r>
-        <w:rPr>
-          <w:rFonts w:ascii="Arial" w:hAnsi="Arial" w:cs="Arial"/>
-          <w:sz w:val="20"/>
-          <w:szCs w:val="20"/>
-        </w:rPr>
-        <w:t>7</w:t>
-      </w:r>
-      <w:r>
-        <w:rPr>
-          <w:rFonts w:ascii="Arial" w:hAnsi="Arial" w:cs="Arial"/>
-          <w:sz w:val="20"/>
-          <w:szCs w:val="20"/>
-        </w:rPr>
-        <w:t xml:space="preserve">:00 a </w:t>
-      </w:r>
-      <w:r>
-        <w:rPr>
-          <w:rFonts w:ascii="Arial" w:hAnsi="Arial" w:cs="Arial"/>
-          <w:sz w:val="20"/>
-          <w:szCs w:val="20"/>
-        </w:rPr>
-        <w:t>20</w:t>
-      </w:r>
-      <w:r>
-        <w:rPr>
-          <w:rFonts w:ascii="Arial" w:hAnsi="Arial" w:cs="Arial"/>
-          <w:sz w:val="20"/>
-          <w:szCs w:val="20"/>
-        </w:rPr>
-        <w:t xml:space="preserve">:00 horas en </w:t>
+          <w:sz w:val="20"/>
+          <w:szCs w:val="20"/>
+        </w:rPr>
+        <w:t xml:space="preserve">en </w:t>
       </w:r>
       <w:r>
         <w:rPr>
@@ -4212,16 +4131,7 @@
           <w:sz w:val="20"/>
           <w:szCs w:val="20"/>
         </w:rPr>
-        <w:t xml:space="preserve">Consejo Técnico u Órgano </w:t>
-      </w:r>
-      <w:proofErr w:type="gramStart"/>
-      <w:r>
-        <w:rPr>
-          <w:rFonts w:ascii="Arial" w:hAnsi="Arial" w:cs="Arial"/>
-          <w:sz w:val="20"/>
-          <w:szCs w:val="20"/>
-        </w:rPr>
-        <w:t>Equivalente</w:t>
+        <w:t>Consejo Técnico u Órgano Equivalente</w:t>
       </w:r>
       <w:r>
         <w:rPr>
@@ -4231,7 +4141,6 @@
         </w:rPr>
         <w:t>,</w:t>
       </w:r>
-      <w:proofErr w:type="gramEnd"/>
       <w:r>
         <w:rPr>
           <w:rFonts w:ascii="Arial" w:hAnsi="Arial" w:cs="Arial"/>
@@ -6061,7 +5970,7 @@
 </file>
 
 <file path=word/endnotes.xml><?xml version="1.0" encoding="utf-8"?>
-<w:endnotes xmlns:wpc="http://schemas.microsoft.com/office/word/2010/wordprocessingCanvas" xmlns:cx="http://schemas.microsoft.com/office/drawing/2014/chartex" xmlns:cx1="http://schemas.microsoft.com/office/drawing/2015/9/8/chartex" xmlns:cx2="http://schemas.microsoft.com/office/drawing/2015/10/21/chartex" xmlns:cx3="http://schemas.microsoft.com/office/drawing/2016/5/9/chartex" xmlns:cx4="http://schemas.microsoft.com/office/drawing/2016/5/10/chartex" xmlns:cx5="http://schemas.microsoft.com/office/drawing/2016/5/11/chartex" xmlns:cx6="http://schemas.microsoft.com/office/drawing/2016/5/12/chartex" xmlns:cx7="http://schemas.microsoft.com/office/drawing/2016/5/13/chartex" xmlns:cx8="http://schemas.microsoft.com/office/drawing/2016/5/14/chartex" xmlns:mc="http://schemas.openxmlformats.org/markup-compatibility/2006" xmlns:aink="http://schemas.microsoft.com/office/drawing/2016/ink" xmlns:am3d="http://schemas.microsoft.com/office/drawing/2017/model3d" xmlns:o="urn:schemas-microsoft-com:office:office" xmlns:oel="http://schemas.microsoft.com/office/2019/extlst" xmlns:r="http://schemas.openxmlformats.org/officeDocument/2006/relationships" xmlns:m="http://schemas.openxmlformats.org/officeDocument/2006/math" xmlns:v="urn:schemas-microsoft-com:vml" xmlns:wp14="http://schemas.microsoft.com/office/word/2010/wordprocessingDrawing" xmlns:wp="http://schemas.openxmlformats.org/drawingml/2006/wordprocessingDrawing" xmlns:w10="urn:schemas-microsoft-com:office:word" xmlns:w="http://schemas.openxmlformats.org/wordprocessingml/2006/main" xmlns:w14="http://schemas.microsoft.com/office/word/2010/wordml" xmlns:w15="http://schemas.microsoft.com/office/word/2012/wordml" xmlns:w16cei="http://schemas.microsoft.com/office/word/2026/wordml/cei" xmlns:w16cex="http://schemas.microsoft.com/office/word/2018/wordml/cex" xmlns:w16cid="http://schemas.microsoft.com/office/word/2016/wordml/cid" xmlns:w16="http://schemas.microsoft.com/office/word/2018/wordml" xmlns:w16du="http://schemas.microsoft.com/office/word/2023/wordml/word16du" xmlns:w16sdtdh="http://schemas.microsoft.com/office/word/2020/wordml/sdtdatahash" xmlns:w16sdtfl="http://schemas.microsoft.com/office/word/2024/wordml/sdtformatlock" xmlns:w16se="http://schemas.microsoft.com/office/word/2015/wordml/symex" xmlns:wpg="http://schemas.microsoft.com/office/word/2010/wordprocessingGroup" xmlns:wpi="http://schemas.microsoft.com/office/word/2010/wordprocessingInk" xmlns:wne="http://schemas.microsoft.com/office/word/2006/wordml" xmlns:wps="http://schemas.microsoft.com/office/word/2010/wordprocessingShape" mc:Ignorable="w14 w15 w16se w16cid w16 w16cex w16sdtdh w16sdtfl w16du wp14">
+<w:endnotes xmlns:wpc="http://schemas.microsoft.com/office/word/2010/wordprocessingCanvas" xmlns:cx="http://schemas.microsoft.com/office/drawing/2014/chartex" xmlns:cx1="http://schemas.microsoft.com/office/drawing/2015/9/8/chartex" xmlns:cx2="http://schemas.microsoft.com/office/drawing/2015/10/21/chartex" xmlns:cx3="http://schemas.microsoft.com/office/drawing/2016/5/9/chartex" xmlns:cx4="http://schemas.microsoft.com/office/drawing/2016/5/10/chartex" xmlns:cx5="http://schemas.microsoft.com/office/drawing/2016/5/11/chartex" xmlns:cx6="http://schemas.microsoft.com/office/drawing/2016/5/12/chartex" xmlns:cx7="http://schemas.microsoft.com/office/drawing/2016/5/13/chartex" xmlns:cx8="http://schemas.microsoft.com/office/drawing/2016/5/14/chartex" xmlns:mc="http://schemas.openxmlformats.org/markup-compatibility/2006" xmlns:aink="http://schemas.microsoft.com/office/drawing/2016/ink" xmlns:am3d="http://schemas.microsoft.com/office/drawing/2017/model3d" xmlns:o="urn:schemas-microsoft-com:office:office" xmlns:oel="http://schemas.microsoft.com/office/2019/extlst" xmlns:r="http://schemas.openxmlformats.org/officeDocument/2006/relationships" xmlns:m="http://schemas.openxmlformats.org/officeDocument/2006/math" xmlns:v="urn:schemas-microsoft-com:vml" xmlns:wp14="http://schemas.microsoft.com/office/word/2010/wordprocessingDrawing" xmlns:wp="http://schemas.openxmlformats.org/drawingml/2006/wordprocessingDrawing" xmlns:w10="urn:schemas-microsoft-com:office:word" xmlns:w="http://schemas.openxmlformats.org/wordprocessingml/2006/main" xmlns:w14="http://schemas.microsoft.com/office/word/2010/wordml" xmlns:w15="http://schemas.microsoft.com/office/word/2012/wordml" xmlns:w16cex="http://schemas.microsoft.com/office/word/2018/wordml/cex" xmlns:w16cid="http://schemas.microsoft.com/office/word/2016/wordml/cid" xmlns:w16="http://schemas.microsoft.com/office/word/2018/wordml" xmlns:w16du="http://schemas.microsoft.com/office/word/2023/wordml/word16du" xmlns:w16sdtdh="http://schemas.microsoft.com/office/word/2020/wordml/sdtdatahash" xmlns:w16sdtfl="http://schemas.microsoft.com/office/word/2024/wordml/sdtformatlock" xmlns:w16se="http://schemas.microsoft.com/office/word/2015/wordml/symex" xmlns:wpg="http://schemas.microsoft.com/office/word/2010/wordprocessingGroup" xmlns:wpi="http://schemas.microsoft.com/office/word/2010/wordprocessingInk" xmlns:wne="http://schemas.microsoft.com/office/word/2006/wordml" xmlns:wps="http://schemas.microsoft.com/office/word/2010/wordprocessingShape" mc:Ignorable="w14 w15 w16se w16cid w16 w16cex w16sdtdh w16sdtfl w16du wp14">
   <w:endnote w:type="separator" w:id="-1">
     <w:p>
       <w:r>
@@ -6080,7 +5989,7 @@
 </file>
 
 <file path=word/footer1.xml><?xml version="1.0" encoding="utf-8"?>
-<w:ftr xmlns:wpc="http://schemas.microsoft.com/office/word/2010/wordprocessingCanvas" xmlns:cx="http://schemas.microsoft.com/office/drawing/2014/chartex" xmlns:cx1="http://schemas.microsoft.com/office/drawing/2015/9/8/chartex" xmlns:cx2="http://schemas.microsoft.com/office/drawing/2015/10/21/chartex" xmlns:cx3="http://schemas.microsoft.com/office/drawing/2016/5/9/chartex" xmlns:cx4="http://schemas.microsoft.com/office/drawing/2016/5/10/chartex" xmlns:cx5="http://schemas.microsoft.com/office/drawing/2016/5/11/chartex" xmlns:cx6="http://schemas.microsoft.com/office/drawing/2016/5/12/chartex" xmlns:cx7="http://schemas.microsoft.com/office/drawing/2016/5/13/chartex" xmlns:cx8="http://schemas.microsoft.com/office/drawing/2016/5/14/chartex" xmlns:mc="http://schemas.openxmlformats.org/markup-compatibility/2006" xmlns:aink="http://schemas.microsoft.com/office/drawing/2016/ink" xmlns:am3d="http://schemas.microsoft.com/office/drawing/2017/model3d" xmlns:o="urn:schemas-microsoft-com:office:office" xmlns:oel="http://schemas.microsoft.com/office/2019/extlst" xmlns:r="http://schemas.openxmlformats.org/officeDocument/2006/relationships" xmlns:m="http://schemas.openxmlformats.org/officeDocument/2006/math" xmlns:v="urn:schemas-microsoft-com:vml" xmlns:wp14="http://schemas.microsoft.com/office/word/2010/wordprocessingDrawing" xmlns:wp="http://schemas.openxmlformats.org/drawingml/2006/wordprocessingDrawing" xmlns:w10="urn:schemas-microsoft-com:office:word" xmlns:w="http://schemas.openxmlformats.org/wordprocessingml/2006/main" xmlns:w14="http://schemas.microsoft.com/office/word/2010/wordml" xmlns:w15="http://schemas.microsoft.com/office/word/2012/wordml" xmlns:w16cei="http://schemas.microsoft.com/office/word/2026/wordml/cei" xmlns:w16cex="http://schemas.microsoft.com/office/word/2018/wordml/cex" xmlns:w16cid="http://schemas.microsoft.com/office/word/2016/wordml/cid" xmlns:w16="http://schemas.microsoft.com/office/word/2018/wordml" xmlns:w16du="http://schemas.microsoft.com/office/word/2023/wordml/word16du" xmlns:w16sdtdh="http://schemas.microsoft.com/office/word/2020/wordml/sdtdatahash" xmlns:w16sdtfl="http://schemas.microsoft.com/office/word/2024/wordml/sdtformatlock" xmlns:w16se="http://schemas.microsoft.com/office/word/2015/wordml/symex" xmlns:wpg="http://schemas.microsoft.com/office/word/2010/wordprocessingGroup" xmlns:wpi="http://schemas.microsoft.com/office/word/2010/wordprocessingInk" xmlns:wne="http://schemas.microsoft.com/office/word/2006/wordml" xmlns:wps="http://schemas.microsoft.com/office/word/2010/wordprocessingShape" mc:Ignorable="w14 w15 w16se w16cid w16 w16cex w16sdtdh w16sdtfl w16du wp14">
+<w:ftr xmlns:wpc="http://schemas.microsoft.com/office/word/2010/wordprocessingCanvas" xmlns:cx="http://schemas.microsoft.com/office/drawing/2014/chartex" xmlns:cx1="http://schemas.microsoft.com/office/drawing/2015/9/8/chartex" xmlns:cx2="http://schemas.microsoft.com/office/drawing/2015/10/21/chartex" xmlns:cx3="http://schemas.microsoft.com/office/drawing/2016/5/9/chartex" xmlns:cx4="http://schemas.microsoft.com/office/drawing/2016/5/10/chartex" xmlns:cx5="http://schemas.microsoft.com/office/drawing/2016/5/11/chartex" xmlns:cx6="http://schemas.microsoft.com/office/drawing/2016/5/12/chartex" xmlns:cx7="http://schemas.microsoft.com/office/drawing/2016/5/13/chartex" xmlns:cx8="http://schemas.microsoft.com/office/drawing/2016/5/14/chartex" xmlns:mc="http://schemas.openxmlformats.org/markup-compatibility/2006" xmlns:aink="http://schemas.microsoft.com/office/drawing/2016/ink" xmlns:am3d="http://schemas.microsoft.com/office/drawing/2017/model3d" xmlns:o="urn:schemas-microsoft-com:office:office" xmlns:oel="http://schemas.microsoft.com/office/2019/extlst" xmlns:r="http://schemas.openxmlformats.org/officeDocument/2006/relationships" xmlns:m="http://schemas.openxmlformats.org/officeDocument/2006/math" xmlns:v="urn:schemas-microsoft-com:vml" xmlns:wp14="http://schemas.microsoft.com/office/word/2010/wordprocessingDrawing" xmlns:wp="http://schemas.openxmlformats.org/drawingml/2006/wordprocessingDrawing" xmlns:w10="urn:schemas-microsoft-com:office:word" xmlns:w="http://schemas.openxmlformats.org/wordprocessingml/2006/main" xmlns:w14="http://schemas.microsoft.com/office/word/2010/wordml" xmlns:w15="http://schemas.microsoft.com/office/word/2012/wordml" xmlns:w16cex="http://schemas.microsoft.com/office/word/2018/wordml/cex" xmlns:w16cid="http://schemas.microsoft.com/office/word/2016/wordml/cid" xmlns:w16="http://schemas.microsoft.com/office/word/2018/wordml" xmlns:w16du="http://schemas.microsoft.com/office/word/2023/wordml/word16du" xmlns:w16sdtdh="http://schemas.microsoft.com/office/word/2020/wordml/sdtdatahash" xmlns:w16sdtfl="http://schemas.microsoft.com/office/word/2024/wordml/sdtformatlock" xmlns:w16se="http://schemas.microsoft.com/office/word/2015/wordml/symex" xmlns:wpg="http://schemas.microsoft.com/office/word/2010/wordprocessingGroup" xmlns:wpi="http://schemas.microsoft.com/office/word/2010/wordprocessingInk" xmlns:wne="http://schemas.microsoft.com/office/word/2006/wordml" xmlns:wps="http://schemas.microsoft.com/office/word/2010/wordprocessingShape" mc:Ignorable="w14 w15 w16se w16cid w16 w16cex w16sdtdh w16sdtfl w16du wp14">
   <w:p>
     <w:pPr>
       <w:pStyle w:val="Textoindependiente"/>
@@ -6255,7 +6164,7 @@
 </file>
 
 <file path=word/footnotes.xml><?xml version="1.0" encoding="utf-8"?>
-<w:footnotes xmlns:wpc="http://schemas.microsoft.com/office/word/2010/wordprocessingCanvas" xmlns:cx="http://schemas.microsoft.com/office/drawing/2014/chartex" xmlns:cx1="http://schemas.microsoft.com/office/drawing/2015/9/8/chartex" xmlns:cx2="http://schemas.microsoft.com/office/drawing/2015/10/21/chartex" xmlns:cx3="http://schemas.microsoft.com/office/drawing/2016/5/9/chartex" xmlns:cx4="http://schemas.microsoft.com/office/drawing/2016/5/10/chartex" xmlns:cx5="http://schemas.microsoft.com/office/drawing/2016/5/11/chartex" xmlns:cx6="http://schemas.microsoft.com/office/drawing/2016/5/12/chartex" xmlns:cx7="http://schemas.microsoft.com/office/drawing/2016/5/13/chartex" xmlns:cx8="http://schemas.microsoft.com/office/drawing/2016/5/14/chartex" xmlns:mc="http://schemas.openxmlformats.org/markup-compatibility/2006" xmlns:aink="http://schemas.microsoft.com/office/drawing/2016/ink" xmlns:am3d="http://schemas.microsoft.com/office/drawing/2017/model3d" xmlns:o="urn:schemas-microsoft-com:office:office" xmlns:oel="http://schemas.microsoft.com/office/2019/extlst" xmlns:r="http://schemas.openxmlformats.org/officeDocument/2006/relationships" xmlns:m="http://schemas.openxmlformats.org/officeDocument/2006/math" xmlns:v="urn:schemas-microsoft-com:vml" xmlns:wp14="http://schemas.microsoft.com/office/word/2010/wordprocessingDrawing" xmlns:wp="http://schemas.openxmlformats.org/drawingml/2006/wordprocessingDrawing" xmlns:w10="urn:schemas-microsoft-com:office:word" xmlns:w="http://schemas.openxmlformats.org/wordprocessingml/2006/main" xmlns:w14="http://schemas.microsoft.com/office/word/2010/wordml" xmlns:w15="http://schemas.microsoft.com/office/word/2012/wordml" xmlns:w16cei="http://schemas.microsoft.com/office/word/2026/wordml/cei" xmlns:w16cex="http://schemas.microsoft.com/office/word/2018/wordml/cex" xmlns:w16cid="http://schemas.microsoft.com/office/word/2016/wordml/cid" xmlns:w16="http://schemas.microsoft.com/office/word/2018/wordml" xmlns:w16du="http://schemas.microsoft.com/office/word/2023/wordml/word16du" xmlns:w16sdtdh="http://schemas.microsoft.com/office/word/2020/wordml/sdtdatahash" xmlns:w16sdtfl="http://schemas.microsoft.com/office/word/2024/wordml/sdtformatlock" xmlns:w16se="http://schemas.microsoft.com/office/word/2015/wordml/symex" xmlns:wpg="http://schemas.microsoft.com/office/word/2010/wordprocessingGroup" xmlns:wpi="http://schemas.microsoft.com/office/word/2010/wordprocessingInk" xmlns:wne="http://schemas.microsoft.com/office/word/2006/wordml" xmlns:wps="http://schemas.microsoft.com/office/word/2010/wordprocessingShape" mc:Ignorable="w14 w15 w16se w16cid w16 w16cex w16sdtdh w16sdtfl w16du wp14">
+<w:footnotes xmlns:wpc="http://schemas.microsoft.com/office/word/2010/wordprocessingCanvas" xmlns:cx="http://schemas.microsoft.com/office/drawing/2014/chartex" xmlns:cx1="http://schemas.microsoft.com/office/drawing/2015/9/8/chartex" xmlns:cx2="http://schemas.microsoft.com/office/drawing/2015/10/21/chartex" xmlns:cx3="http://schemas.microsoft.com/office/drawing/2016/5/9/chartex" xmlns:cx4="http://schemas.microsoft.com/office/drawing/2016/5/10/chartex" xmlns:cx5="http://schemas.microsoft.com/office/drawing/2016/5/11/chartex" xmlns:cx6="http://schemas.microsoft.com/office/drawing/2016/5/12/chartex" xmlns:cx7="http://schemas.microsoft.com/office/drawing/2016/5/13/chartex" xmlns:cx8="http://schemas.microsoft.com/office/drawing/2016/5/14/chartex" xmlns:mc="http://schemas.openxmlformats.org/markup-compatibility/2006" xmlns:aink="http://schemas.microsoft.com/office/drawing/2016/ink" xmlns:am3d="http://schemas.microsoft.com/office/drawing/2017/model3d" xmlns:o="urn:schemas-microsoft-com:office:office" xmlns:oel="http://schemas.microsoft.com/office/2019/extlst" xmlns:r="http://schemas.openxmlformats.org/officeDocument/2006/relationships" xmlns:m="http://schemas.openxmlformats.org/officeDocument/2006/math" xmlns:v="urn:schemas-microsoft-com:vml" xmlns:wp14="http://schemas.microsoft.com/office/word/2010/wordprocessingDrawing" xmlns:wp="http://schemas.openxmlformats.org/drawingml/2006/wordprocessingDrawing" xmlns:w10="urn:schemas-microsoft-com:office:word" xmlns:w="http://schemas.openxmlformats.org/wordprocessingml/2006/main" xmlns:w14="http://schemas.microsoft.com/office/word/2010/wordml" xmlns:w15="http://schemas.microsoft.com/office/word/2012/wordml" xmlns:w16cex="http://schemas.microsoft.com/office/word/2018/wordml/cex" xmlns:w16cid="http://schemas.microsoft.com/office/word/2016/wordml/cid" xmlns:w16="http://schemas.microsoft.com/office/word/2018/wordml" xmlns:w16du="http://schemas.microsoft.com/office/word/2023/wordml/word16du" xmlns:w16sdtdh="http://schemas.microsoft.com/office/word/2020/wordml/sdtdatahash" xmlns:w16sdtfl="http://schemas.microsoft.com/office/word/2024/wordml/sdtformatlock" xmlns:w16se="http://schemas.microsoft.com/office/word/2015/wordml/symex" xmlns:wpg="http://schemas.microsoft.com/office/word/2010/wordprocessingGroup" xmlns:wpi="http://schemas.microsoft.com/office/word/2010/wordprocessingInk" xmlns:wne="http://schemas.microsoft.com/office/word/2006/wordml" xmlns:wps="http://schemas.microsoft.com/office/word/2010/wordprocessingShape" mc:Ignorable="w14 w15 w16se w16cid w16 w16cex w16sdtdh w16sdtfl w16du wp14">
   <w:footnote w:type="separator" w:id="-1">
     <w:p>
       <w:r>
@@ -6274,7 +6183,7 @@
 </file>
 
 <file path=word/header1.xml><?xml version="1.0" encoding="utf-8"?>
-<w:hdr xmlns:wpc="http://schemas.microsoft.com/office/word/2010/wordprocessingCanvas" xmlns:cx="http://schemas.microsoft.com/office/drawing/2014/chartex" xmlns:cx1="http://schemas.microsoft.com/office/drawing/2015/9/8/chartex" xmlns:cx2="http://schemas.microsoft.com/office/drawing/2015/10/21/chartex" xmlns:cx3="http://schemas.microsoft.com/office/drawing/2016/5/9/chartex" xmlns:cx4="http://schemas.microsoft.com/office/drawing/2016/5/10/chartex" xmlns:cx5="http://schemas.microsoft.com/office/drawing/2016/5/11/chartex" xmlns:cx6="http://schemas.microsoft.com/office/drawing/2016/5/12/chartex" xmlns:cx7="http://schemas.microsoft.com/office/drawing/2016/5/13/chartex" xmlns:cx8="http://schemas.microsoft.com/office/drawing/2016/5/14/chartex" xmlns:mc="http://schemas.openxmlformats.org/markup-compatibility/2006" xmlns:aink="http://schemas.microsoft.com/office/drawing/2016/ink" xmlns:am3d="http://schemas.microsoft.com/office/drawing/2017/model3d" xmlns:o="urn:schemas-microsoft-com:office:office" xmlns:oel="http://schemas.microsoft.com/office/2019/extlst" xmlns:r="http://schemas.openxmlformats.org/officeDocument/2006/relationships" xmlns:m="http://schemas.openxmlformats.org/officeDocument/2006/math" xmlns:v="urn:schemas-microsoft-com:vml" xmlns:wp14="http://schemas.microsoft.com/office/word/2010/wordprocessingDrawing" xmlns:wp="http://schemas.openxmlformats.org/drawingml/2006/wordprocessingDrawing" xmlns:w10="urn:schemas-microsoft-com:office:word" xmlns:w="http://schemas.openxmlformats.org/wordprocessingml/2006/main" xmlns:w14="http://schemas.microsoft.com/office/word/2010/wordml" xmlns:w15="http://schemas.microsoft.com/office/word/2012/wordml" xmlns:w16cei="http://schemas.microsoft.com/office/word/2026/wordml/cei" xmlns:w16cex="http://schemas.microsoft.com/office/word/2018/wordml/cex" xmlns:w16cid="http://schemas.microsoft.com/office/word/2016/wordml/cid" xmlns:w16="http://schemas.microsoft.com/office/word/2018/wordml" xmlns:w16du="http://schemas.microsoft.com/office/word/2023/wordml/word16du" xmlns:w16sdtdh="http://schemas.microsoft.com/office/word/2020/wordml/sdtdatahash" xmlns:w16sdtfl="http://schemas.microsoft.com/office/word/2024/wordml/sdtformatlock" xmlns:w16se="http://schemas.microsoft.com/office/word/2015/wordml/symex" xmlns:wpg="http://schemas.microsoft.com/office/word/2010/wordprocessingGroup" xmlns:wpi="http://schemas.microsoft.com/office/word/2010/wordprocessingInk" xmlns:wne="http://schemas.microsoft.com/office/word/2006/wordml" xmlns:wps="http://schemas.microsoft.com/office/word/2010/wordprocessingShape" mc:Ignorable="w14 w15 w16se w16cid w16 w16cex w16sdtdh w16sdtfl w16du wp14">
+<w:hdr xmlns:wpc="http://schemas.microsoft.com/office/word/2010/wordprocessingCanvas" xmlns:cx="http://schemas.microsoft.com/office/drawing/2014/chartex" xmlns:cx1="http://schemas.microsoft.com/office/drawing/2015/9/8/chartex" xmlns:cx2="http://schemas.microsoft.com/office/drawing/2015/10/21/chartex" xmlns:cx3="http://schemas.microsoft.com/office/drawing/2016/5/9/chartex" xmlns:cx4="http://schemas.microsoft.com/office/drawing/2016/5/10/chartex" xmlns:cx5="http://schemas.microsoft.com/office/drawing/2016/5/11/chartex" xmlns:cx6="http://schemas.microsoft.com/office/drawing/2016/5/12/chartex" xmlns:cx7="http://schemas.microsoft.com/office/drawing/2016/5/13/chartex" xmlns:cx8="http://schemas.microsoft.com/office/drawing/2016/5/14/chartex" xmlns:mc="http://schemas.openxmlformats.org/markup-compatibility/2006" xmlns:aink="http://schemas.microsoft.com/office/drawing/2016/ink" xmlns:am3d="http://schemas.microsoft.com/office/drawing/2017/model3d" xmlns:o="urn:schemas-microsoft-com:office:office" xmlns:oel="http://schemas.microsoft.com/office/2019/extlst" xmlns:r="http://schemas.openxmlformats.org/officeDocument/2006/relationships" xmlns:m="http://schemas.openxmlformats.org/officeDocument/2006/math" xmlns:v="urn:schemas-microsoft-com:vml" xmlns:wp14="http://schemas.microsoft.com/office/word/2010/wordprocessingDrawing" xmlns:wp="http://schemas.openxmlformats.org/drawingml/2006/wordprocessingDrawing" xmlns:w10="urn:schemas-microsoft-com:office:word" xmlns:w="http://schemas.openxmlformats.org/wordprocessingml/2006/main" xmlns:w14="http://schemas.microsoft.com/office/word/2010/wordml" xmlns:w15="http://schemas.microsoft.com/office/word/2012/wordml" xmlns:w16cex="http://schemas.microsoft.com/office/word/2018/wordml/cex" xmlns:w16cid="http://schemas.microsoft.com/office/word/2016/wordml/cid" xmlns:w16="http://schemas.microsoft.com/office/word/2018/wordml" xmlns:w16du="http://schemas.microsoft.com/office/word/2023/wordml/word16du" xmlns:w16sdtdh="http://schemas.microsoft.com/office/word/2020/wordml/sdtdatahash" xmlns:w16sdtfl="http://schemas.microsoft.com/office/word/2024/wordml/sdtformatlock" xmlns:w16se="http://schemas.microsoft.com/office/word/2015/wordml/symex" xmlns:wpg="http://schemas.microsoft.com/office/word/2010/wordprocessingGroup" xmlns:wpi="http://schemas.microsoft.com/office/word/2010/wordprocessingInk" xmlns:wne="http://schemas.microsoft.com/office/word/2006/wordml" xmlns:wps="http://schemas.microsoft.com/office/word/2010/wordprocessingShape" mc:Ignorable="w14 w15 w16se w16cid w16 w16cex w16sdtdh w16sdtfl w16du wp14">
   <w:p>
     <w:pPr>
       <w:tabs>
@@ -6436,6 +6345,13 @@
         <w:sz w:val="20"/>
       </w:rPr>
     </w:pPr>
+    <w:r>
+      <w:rPr>
+        <w:rFonts w:ascii="Arial" w:hAnsi="Arial" w:cs="Arial"/>
+        <w:sz w:val="20"/>
+      </w:rPr>
+      <w:t xml:space="preserve">Dirección General de Área Académica </w:t>
+    </w:r>
     <w:sdt>
       <w:sdtPr>
         <w:rPr>
@@ -6558,7 +6474,7 @@
 </file>
 
 <file path=word/numbering.xml><?xml version="1.0" encoding="utf-8"?>
-<w:numbering xmlns:wpc="http://schemas.microsoft.com/office/word/2010/wordprocessingCanvas" xmlns:cx="http://schemas.microsoft.com/office/drawing/2014/chartex" xmlns:cx1="http://schemas.microsoft.com/office/drawing/2015/9/8/chartex" xmlns:cx2="http://schemas.microsoft.com/office/drawing/2015/10/21/chartex" xmlns:cx3="http://schemas.microsoft.com/office/drawing/2016/5/9/chartex" xmlns:cx4="http://schemas.microsoft.com/office/drawing/2016/5/10/chartex" xmlns:cx5="http://schemas.microsoft.com/office/drawing/2016/5/11/chartex" xmlns:cx6="http://schemas.microsoft.com/office/drawing/2016/5/12/chartex" xmlns:cx7="http://schemas.microsoft.com/office/drawing/2016/5/13/chartex" xmlns:cx8="http://schemas.microsoft.com/office/drawing/2016/5/14/chartex" xmlns:mc="http://schemas.openxmlformats.org/markup-compatibility/2006" xmlns:aink="http://schemas.microsoft.com/office/drawing/2016/ink" xmlns:am3d="http://schemas.microsoft.com/office/drawing/2017/model3d" xmlns:o="urn:schemas-microsoft-com:office:office" xmlns:oel="http://schemas.microsoft.com/office/2019/extlst" xmlns:r="http://schemas.openxmlformats.org/officeDocument/2006/relationships" xmlns:m="http://schemas.openxmlformats.org/officeDocument/2006/math" xmlns:v="urn:schemas-microsoft-com:vml" xmlns:wp14="http://schemas.microsoft.com/office/word/2010/wordprocessingDrawing" xmlns:wp="http://schemas.openxmlformats.org/drawingml/2006/wordprocessingDrawing" xmlns:w10="urn:schemas-microsoft-com:office:word" xmlns:w="http://schemas.openxmlformats.org/wordprocessingml/2006/main" xmlns:w14="http://schemas.microsoft.com/office/word/2010/wordml" xmlns:w15="http://schemas.microsoft.com/office/word/2012/wordml" xmlns:w16cei="http://schemas.microsoft.com/office/word/2026/wordml/cei" xmlns:w16cex="http://schemas.microsoft.com/office/word/2018/wordml/cex" xmlns:w16cid="http://schemas.microsoft.com/office/word/2016/wordml/cid" xmlns:w16="http://schemas.microsoft.com/office/word/2018/wordml" xmlns:w16du="http://schemas.microsoft.com/office/word/2023/wordml/word16du" xmlns:w16sdtdh="http://schemas.microsoft.com/office/word/2020/wordml/sdtdatahash" xmlns:w16sdtfl="http://schemas.microsoft.com/office/word/2024/wordml/sdtformatlock" xmlns:w16se="http://schemas.microsoft.com/office/word/2015/wordml/symex" xmlns:wpg="http://schemas.microsoft.com/office/word/2010/wordprocessingGroup" xmlns:wpi="http://schemas.microsoft.com/office/word/2010/wordprocessingInk" xmlns:wne="http://schemas.microsoft.com/office/word/2006/wordml" xmlns:wps="http://schemas.microsoft.com/office/word/2010/wordprocessingShape" mc:Ignorable="w14 w15 w16se w16cid w16 w16cex w16sdtdh w16sdtfl w16du wp14">
+<w:numbering xmlns:wpc="http://schemas.microsoft.com/office/word/2010/wordprocessingCanvas" xmlns:cx="http://schemas.microsoft.com/office/drawing/2014/chartex" xmlns:cx1="http://schemas.microsoft.com/office/drawing/2015/9/8/chartex" xmlns:cx2="http://schemas.microsoft.com/office/drawing/2015/10/21/chartex" xmlns:cx3="http://schemas.microsoft.com/office/drawing/2016/5/9/chartex" xmlns:cx4="http://schemas.microsoft.com/office/drawing/2016/5/10/chartex" xmlns:cx5="http://schemas.microsoft.com/office/drawing/2016/5/11/chartex" xmlns:cx6="http://schemas.microsoft.com/office/drawing/2016/5/12/chartex" xmlns:cx7="http://schemas.microsoft.com/office/drawing/2016/5/13/chartex" xmlns:cx8="http://schemas.microsoft.com/office/drawing/2016/5/14/chartex" xmlns:mc="http://schemas.openxmlformats.org/markup-compatibility/2006" xmlns:aink="http://schemas.microsoft.com/office/drawing/2016/ink" xmlns:am3d="http://schemas.microsoft.com/office/drawing/2017/model3d" xmlns:o="urn:schemas-microsoft-com:office:office" xmlns:oel="http://schemas.microsoft.com/office/2019/extlst" xmlns:r="http://schemas.openxmlformats.org/officeDocument/2006/relationships" xmlns:m="http://schemas.openxmlformats.org/officeDocument/2006/math" xmlns:v="urn:schemas-microsoft-com:vml" xmlns:wp14="http://schemas.microsoft.com/office/word/2010/wordprocessingDrawing" xmlns:wp="http://schemas.openxmlformats.org/drawingml/2006/wordprocessingDrawing" xmlns:w10="urn:schemas-microsoft-com:office:word" xmlns:w="http://schemas.openxmlformats.org/wordprocessingml/2006/main" xmlns:w14="http://schemas.microsoft.com/office/word/2010/wordml" xmlns:w15="http://schemas.microsoft.com/office/word/2012/wordml" xmlns:w16cex="http://schemas.microsoft.com/office/word/2018/wordml/cex" xmlns:w16cid="http://schemas.microsoft.com/office/word/2016/wordml/cid" xmlns:w16="http://schemas.microsoft.com/office/word/2018/wordml" xmlns:w16du="http://schemas.microsoft.com/office/word/2023/wordml/word16du" xmlns:w16sdtdh="http://schemas.microsoft.com/office/word/2020/wordml/sdtdatahash" xmlns:w16sdtfl="http://schemas.microsoft.com/office/word/2024/wordml/sdtformatlock" xmlns:w16se="http://schemas.microsoft.com/office/word/2015/wordml/symex" xmlns:wpg="http://schemas.microsoft.com/office/word/2010/wordprocessingGroup" xmlns:wpi="http://schemas.microsoft.com/office/word/2010/wordprocessingInk" xmlns:wne="http://schemas.microsoft.com/office/word/2006/wordml" xmlns:wps="http://schemas.microsoft.com/office/word/2010/wordprocessingShape" mc:Ignorable="w14 w15 w16se w16cid w16 w16cex w16sdtdh w16sdtfl w16du wp14">
   <w:abstractNum w:abstractNumId="0" w15:restartNumberingAfterBreak="0">
     <w:nsid w:val="01402CE7"/>
     <w:multiLevelType w:val="hybridMultilevel"/>
@@ -8579,7 +8495,7 @@
 </file>
 
 <file path=word/glossary/document.xml><?xml version="1.0" encoding="utf-8"?>
-<w:glossaryDocument xmlns:wpc="http://schemas.microsoft.com/office/word/2010/wordprocessingCanvas" xmlns:cx="http://schemas.microsoft.com/office/drawing/2014/chartex" xmlns:cx1="http://schemas.microsoft.com/office/drawing/2015/9/8/chartex" xmlns:cx2="http://schemas.microsoft.com/office/drawing/2015/10/21/chartex" xmlns:cx3="http://schemas.microsoft.com/office/drawing/2016/5/9/chartex" xmlns:cx4="http://schemas.microsoft.com/office/drawing/2016/5/10/chartex" xmlns:cx5="http://schemas.microsoft.com/office/drawing/2016/5/11/chartex" xmlns:cx6="http://schemas.microsoft.com/office/drawing/2016/5/12/chartex" xmlns:cx7="http://schemas.microsoft.com/office/drawing/2016/5/13/chartex" xmlns:cx8="http://schemas.microsoft.com/office/drawing/2016/5/14/chartex" xmlns:mc="http://schemas.openxmlformats.org/markup-compatibility/2006" xmlns:aink="http://schemas.microsoft.com/office/drawing/2016/ink" xmlns:am3d="http://schemas.microsoft.com/office/drawing/2017/model3d" xmlns:o="urn:schemas-microsoft-com:office:office" xmlns:oel="http://schemas.microsoft.com/office/2019/extlst" xmlns:r="http://schemas.openxmlformats.org/officeDocument/2006/relationships" xmlns:m="http://schemas.openxmlformats.org/officeDocument/2006/math" xmlns:v="urn:schemas-microsoft-com:vml" xmlns:wp14="http://schemas.microsoft.com/office/word/2010/wordprocessingDrawing" xmlns:wp="http://schemas.openxmlformats.org/drawingml/2006/wordprocessingDrawing" xmlns:w10="urn:schemas-microsoft-com:office:word" xmlns:w="http://schemas.openxmlformats.org/wordprocessingml/2006/main" xmlns:w14="http://schemas.microsoft.com/office/word/2010/wordml" xmlns:w15="http://schemas.microsoft.com/office/word/2012/wordml" xmlns:w16cei="http://schemas.microsoft.com/office/word/2026/wordml/cei" xmlns:w16cex="http://schemas.microsoft.com/office/word/2018/wordml/cex" xmlns:w16cid="http://schemas.microsoft.com/office/word/2016/wordml/cid" xmlns:w16="http://schemas.microsoft.com/office/word/2018/wordml" xmlns:w16du="http://schemas.microsoft.com/office/word/2023/wordml/word16du" xmlns:w16sdtdh="http://schemas.microsoft.com/office/word/2020/wordml/sdtdatahash" xmlns:w16sdtfl="http://schemas.microsoft.com/office/word/2024/wordml/sdtformatlock" xmlns:w16se="http://schemas.microsoft.com/office/word/2015/wordml/symex" xmlns:wpg="http://schemas.microsoft.com/office/word/2010/wordprocessingGroup" xmlns:wpi="http://schemas.microsoft.com/office/word/2010/wordprocessingInk" xmlns:wne="http://schemas.microsoft.com/office/word/2006/wordml" xmlns:wps="http://schemas.microsoft.com/office/word/2010/wordprocessingShape" mc:Ignorable="w14 w15 w16se w16cid w16 w16cex w16sdtdh w16sdtfl w16du wp14">
+<w:glossaryDocument xmlns:wpc="http://schemas.microsoft.com/office/word/2010/wordprocessingCanvas" xmlns:cx="http://schemas.microsoft.com/office/drawing/2014/chartex" xmlns:cx1="http://schemas.microsoft.com/office/drawing/2015/9/8/chartex" xmlns:cx2="http://schemas.microsoft.com/office/drawing/2015/10/21/chartex" xmlns:cx3="http://schemas.microsoft.com/office/drawing/2016/5/9/chartex" xmlns:cx4="http://schemas.microsoft.com/office/drawing/2016/5/10/chartex" xmlns:cx5="http://schemas.microsoft.com/office/drawing/2016/5/11/chartex" xmlns:cx6="http://schemas.microsoft.com/office/drawing/2016/5/12/chartex" xmlns:cx7="http://schemas.microsoft.com/office/drawing/2016/5/13/chartex" xmlns:cx8="http://schemas.microsoft.com/office/drawing/2016/5/14/chartex" xmlns:mc="http://schemas.openxmlformats.org/markup-compatibility/2006" xmlns:aink="http://schemas.microsoft.com/office/drawing/2016/ink" xmlns:am3d="http://schemas.microsoft.com/office/drawing/2017/model3d" xmlns:o="urn:schemas-microsoft-com:office:office" xmlns:oel="http://schemas.microsoft.com/office/2019/extlst" xmlns:r="http://schemas.openxmlformats.org/officeDocument/2006/relationships" xmlns:m="http://schemas.openxmlformats.org/officeDocument/2006/math" xmlns:v="urn:schemas-microsoft-com:vml" xmlns:wp14="http://schemas.microsoft.com/office/word/2010/wordprocessingDrawing" xmlns:wp="http://schemas.openxmlformats.org/drawingml/2006/wordprocessingDrawing" xmlns:w10="urn:schemas-microsoft-com:office:word" xmlns:w="http://schemas.openxmlformats.org/wordprocessingml/2006/main" xmlns:w14="http://schemas.microsoft.com/office/word/2010/wordml" xmlns:w15="http://schemas.microsoft.com/office/word/2012/wordml" xmlns:w16cex="http://schemas.microsoft.com/office/word/2018/wordml/cex" xmlns:w16cid="http://schemas.microsoft.com/office/word/2016/wordml/cid" xmlns:w16="http://schemas.microsoft.com/office/word/2018/wordml" xmlns:w16du="http://schemas.microsoft.com/office/word/2023/wordml/word16du" xmlns:w16sdtdh="http://schemas.microsoft.com/office/word/2020/wordml/sdtdatahash" xmlns:w16sdtfl="http://schemas.microsoft.com/office/word/2024/wordml/sdtformatlock" xmlns:w16se="http://schemas.microsoft.com/office/word/2015/wordml/symex" xmlns:wpg="http://schemas.microsoft.com/office/word/2010/wordprocessingGroup" xmlns:wpi="http://schemas.microsoft.com/office/word/2010/wordprocessingInk" xmlns:wne="http://schemas.microsoft.com/office/word/2006/wordml" xmlns:wps="http://schemas.microsoft.com/office/word/2010/wordprocessingShape" mc:Ignorable="w14 w15 w16se w16cid w16 w16cex w16sdtdh w16sdtfl w16du wp14">
   <w:docParts>
     <w:docPart>
       <w:docPartPr>
@@ -8644,11 +8560,10 @@
   </w:font>
   <w:font w:name="Gill Sans MT">
     <w:altName w:val="Times New Roman"/>
-    <w:panose1 w:val="020B0502020104020203"/>
     <w:charset w:val="00"/>
     <w:family w:val="swiss"/>
     <w:pitch w:val="variable"/>
-    <w:sig w:usb0="00000007" w:usb1="00000000" w:usb2="00000000" w:usb3="00000000" w:csb0="00000003" w:csb1="00000000"/>
+    <w:sig w:usb0="00000003" w:usb1="00000000" w:usb2="00000000" w:usb3="00000000" w:csb0="00000003" w:csb1="00000000"/>
   </w:font>
   <w:font w:name="Calibri">
     <w:panose1 w:val="020F0502020204030204"/>
@@ -8717,11 +8632,13 @@
   </w:compat>
   <w:rsids>
     <w:rsidRoot w:val="00081CDB"/>
+    <w:rsid w:val="00053C4F"/>
     <w:rsid w:val="00070C57"/>
     <w:rsid w:val="00081CDB"/>
     <w:rsid w:val="00116312"/>
     <w:rsid w:val="00240534"/>
     <w:rsid w:val="0042343D"/>
+    <w:rsid w:val="006E6820"/>
     <w:rsid w:val="00812D09"/>
     <w:rsid w:val="008D42D2"/>
     <w:rsid w:val="008F781C"/>

</xml_diff>